<commit_message>
Update to CHSython July 2026
Update to CHSython July 2026

- Added CATools Functionality
- Fixed and cleaned up Data Submission/Finalization Steps
- Removed non-required Libraries
- cleaned up code
</commit_message>
<xml_diff>
--- a/1001_07_A_F01_Template.docx
+++ b/1001_07_A_F01_Template.docx
@@ -1,6 +1,6 @@
 
 <file path=word/document.xml><?xml version="1.0" encoding="utf-8"?>
-<w:document xmlns:wpc="http://schemas.microsoft.com/office/word/2010/wordprocessingCanvas" xmlns:cx="http://schemas.microsoft.com/office/drawing/2014/chartex" xmlns:cx1="http://schemas.microsoft.com/office/drawing/2015/9/8/chartex" xmlns:mc="http://schemas.openxmlformats.org/markup-compatibility/2006" xmlns:o="urn:schemas-microsoft-com:office:office" xmlns:r="http://schemas.openxmlformats.org/officeDocument/2006/relationships" xmlns:m="http://schemas.openxmlformats.org/officeDocument/2006/math" xmlns:v="urn:schemas-microsoft-com:vml" xmlns:wp14="http://schemas.microsoft.com/office/word/2010/wordprocessingDrawing" xmlns:wp="http://schemas.openxmlformats.org/drawingml/2006/wordprocessingDrawing" xmlns:w10="urn:schemas-microsoft-com:office:word" xmlns:w="http://schemas.openxmlformats.org/wordprocessingml/2006/main" xmlns:w14="http://schemas.microsoft.com/office/word/2010/wordml" xmlns:w15="http://schemas.microsoft.com/office/word/2012/wordml" xmlns:w16se="http://schemas.microsoft.com/office/word/2015/wordml/symex" xmlns:wpg="http://schemas.microsoft.com/office/word/2010/wordprocessingGroup" xmlns:wpi="http://schemas.microsoft.com/office/word/2010/wordprocessingInk" xmlns:wne="http://schemas.microsoft.com/office/word/2006/wordml" xmlns:wps="http://schemas.microsoft.com/office/word/2010/wordprocessingShape" mc:Ignorable="w14 w15 w16se wp14">
+<w:document xmlns:wpc="http://schemas.microsoft.com/office/word/2010/wordprocessingCanvas" xmlns:cx="http://schemas.microsoft.com/office/drawing/2014/chartex" xmlns:cx1="http://schemas.microsoft.com/office/drawing/2015/9/8/chartex" xmlns:cx2="http://schemas.microsoft.com/office/drawing/2015/10/21/chartex" xmlns:cx3="http://schemas.microsoft.com/office/drawing/2016/5/9/chartex" xmlns:cx4="http://schemas.microsoft.com/office/drawing/2016/5/10/chartex" xmlns:cx5="http://schemas.microsoft.com/office/drawing/2016/5/11/chartex" xmlns:cx6="http://schemas.microsoft.com/office/drawing/2016/5/12/chartex" xmlns:cx7="http://schemas.microsoft.com/office/drawing/2016/5/13/chartex" xmlns:cx8="http://schemas.microsoft.com/office/drawing/2016/5/14/chartex" xmlns:mc="http://schemas.openxmlformats.org/markup-compatibility/2006" xmlns:aink="http://schemas.microsoft.com/office/drawing/2016/ink" xmlns:am3d="http://schemas.microsoft.com/office/drawing/2017/model3d" xmlns:o="urn:schemas-microsoft-com:office:office" xmlns:oel="http://schemas.microsoft.com/office/2019/extlst" xmlns:r="http://schemas.openxmlformats.org/officeDocument/2006/relationships" xmlns:m="http://schemas.openxmlformats.org/officeDocument/2006/math" xmlns:v="urn:schemas-microsoft-com:vml" xmlns:wp14="http://schemas.microsoft.com/office/word/2010/wordprocessingDrawing" xmlns:wp="http://schemas.openxmlformats.org/drawingml/2006/wordprocessingDrawing" xmlns:w10="urn:schemas-microsoft-com:office:word" xmlns:w="http://schemas.openxmlformats.org/wordprocessingml/2006/main" xmlns:w14="http://schemas.microsoft.com/office/word/2010/wordml" xmlns:w15="http://schemas.microsoft.com/office/word/2012/wordml" xmlns:w16cex="http://schemas.microsoft.com/office/word/2018/wordml/cex" xmlns:w16cid="http://schemas.microsoft.com/office/word/2016/wordml/cid" xmlns:w16="http://schemas.microsoft.com/office/word/2018/wordml" xmlns:w16du="http://schemas.microsoft.com/office/word/2023/wordml/word16du" xmlns:w16sdtdh="http://schemas.microsoft.com/office/word/2020/wordml/sdtdatahash" xmlns:w16sdtfl="http://schemas.microsoft.com/office/word/2024/wordml/sdtformatlock" xmlns:w16se="http://schemas.microsoft.com/office/word/2015/wordml/symex" xmlns:wpg="http://schemas.microsoft.com/office/word/2010/wordprocessingGroup" xmlns:wpi="http://schemas.microsoft.com/office/word/2010/wordprocessingInk" xmlns:wne="http://schemas.microsoft.com/office/word/2006/wordml" xmlns:wps="http://schemas.microsoft.com/office/word/2010/wordprocessingShape" mc:Ignorable="w14 w15 w16se w16cid w16 w16cex w16sdtdh w16sdtfl w16du wp14">
   <w:body>
     <w:p>
       <w:pPr>
@@ -15,7 +15,7 @@
     </w:p>
     <w:tbl>
       <w:tblPr>
-        <w:tblW w:w="13878" w:type="dxa"/>
+        <w:tblW w:w="13509" w:type="dxa"/>
         <w:jc w:val="center"/>
         <w:tblBorders>
           <w:top w:val="single" w:sz="4" w:space="0" w:color="auto"/>
@@ -29,25 +29,31 @@
         <w:tblLook w:val="0000" w:firstRow="0" w:lastRow="0" w:firstColumn="0" w:lastColumn="0" w:noHBand="0" w:noVBand="0"/>
       </w:tblPr>
       <w:tblGrid>
-        <w:gridCol w:w="2084"/>
-        <w:gridCol w:w="2986"/>
+        <w:gridCol w:w="2165"/>
+        <w:gridCol w:w="2905"/>
         <w:gridCol w:w="1275"/>
         <w:gridCol w:w="1418"/>
         <w:gridCol w:w="1701"/>
-        <w:gridCol w:w="1984"/>
-        <w:gridCol w:w="2410"/>
-        <w:gridCol w:w="20"/>
+        <w:gridCol w:w="652"/>
+        <w:gridCol w:w="3383"/>
+        <w:gridCol w:w="10"/>
       </w:tblGrid>
       <w:tr>
+        <w:tblPrEx>
+          <w:tblCellMar>
+            <w:top w:w="0" w:type="dxa"/>
+            <w:bottom w:w="0" w:type="dxa"/>
+          </w:tblCellMar>
+        </w:tblPrEx>
         <w:trPr>
           <w:gridAfter w:val="1"/>
-          <w:wAfter w:w="20" w:type="dxa"/>
+          <w:wAfter w:w="10" w:type="dxa"/>
           <w:cantSplit/>
           <w:jc w:val="center"/>
         </w:trPr>
         <w:tc>
           <w:tcPr>
-            <w:tcW w:w="13858" w:type="dxa"/>
+            <w:tcW w:w="13499" w:type="dxa"/>
             <w:gridSpan w:val="7"/>
             <w:shd w:val="pct10" w:color="auto" w:fill="FFFFFF"/>
           </w:tcPr>
@@ -71,22 +77,22 @@
         </w:tc>
       </w:tr>
       <w:tr>
+        <w:tblPrEx>
+          <w:tblCellMar>
+            <w:top w:w="0" w:type="dxa"/>
+            <w:bottom w:w="0" w:type="dxa"/>
+          </w:tblCellMar>
+        </w:tblPrEx>
         <w:trPr>
           <w:gridAfter w:val="1"/>
-          <w:wAfter w:w="20" w:type="dxa"/>
+          <w:wAfter w:w="10" w:type="dxa"/>
           <w:jc w:val="center"/>
         </w:trPr>
         <w:tc>
           <w:tcPr>
-            <w:tcW w:w="11448" w:type="dxa"/>
-            <w:gridSpan w:val="6"/>
+            <w:tcW w:w="13499" w:type="dxa"/>
+            <w:gridSpan w:val="7"/>
           </w:tcPr>
-          <w:p/>
-        </w:tc>
-        <w:tc>
-          <w:tcPr>
-            <w:tcW w:w="2410" w:type="dxa"/>
-          </w:tcPr>
           <w:p>
             <w:pPr>
               <w:pStyle w:val="BodyText"/>
@@ -104,10 +110,86 @@
                 <w:sz w:val="20"/>
               </w:rPr>
             </w:pPr>
+            <w:r>
+              <w:rPr>
+                <w:rFonts w:ascii="Arial" w:hAnsi="Arial" w:cs="Arial"/>
+                <w:sz w:val="20"/>
+              </w:rPr>
+              <w:t>Project Number &amp; Location</w:t>
+            </w:r>
+            <w:r>
+              <w:rPr>
+                <w:rFonts w:ascii="Arial" w:hAnsi="Arial" w:cs="Arial"/>
+                <w:sz w:val="20"/>
+              </w:rPr>
+              <w:t>: 9</w:t>
+            </w:r>
+            <w:r>
+              <w:rPr>
+                <w:rFonts w:ascii="Arial" w:hAnsi="Arial" w:cs="Arial"/>
+                <w:sz w:val="20"/>
+              </w:rPr>
+              <w:t>XX</w:t>
+            </w:r>
+            <w:r>
+              <w:rPr>
+                <w:rFonts w:ascii="Arial" w:hAnsi="Arial" w:cs="Arial"/>
+                <w:sz w:val="20"/>
+              </w:rPr>
+              <w:t>XXXX_AREA_PROVINCE_YEAR</w:t>
+            </w:r>
+            <w:r>
+              <w:rPr>
+                <w:rFonts w:ascii="Arial" w:hAnsi="Arial" w:cs="Arial"/>
+                <w:sz w:val="20"/>
+              </w:rPr>
+              <w:t>_</w:t>
+            </w:r>
+            <w:r>
+              <w:rPr>
+                <w:rFonts w:ascii="Arial" w:hAnsi="Arial" w:cs="Arial"/>
+                <w:sz w:val="20"/>
+              </w:rPr>
+              <w:t>{</w:t>
+            </w:r>
+            <w:r>
+              <w:rPr>
+                <w:rFonts w:ascii="Arial" w:hAnsi="Arial" w:cs="Arial"/>
+                <w:sz w:val="20"/>
+              </w:rPr>
+              <w:t>LIDAR</w:t>
+            </w:r>
+            <w:r>
+              <w:rPr>
+                <w:rFonts w:ascii="Arial" w:hAnsi="Arial" w:cs="Arial"/>
+                <w:sz w:val="20"/>
+              </w:rPr>
+              <w:t xml:space="preserve"> </w:t>
+            </w:r>
+            <w:r>
+              <w:rPr>
+                <w:rFonts w:ascii="Arial" w:hAnsi="Arial" w:cs="Arial"/>
+                <w:sz w:val="20"/>
+              </w:rPr>
+              <w:t>*if applicable</w:t>
+            </w:r>
+            <w:r>
+              <w:rPr>
+                <w:rFonts w:ascii="Arial" w:hAnsi="Arial" w:cs="Arial"/>
+                <w:sz w:val="20"/>
+              </w:rPr>
+              <w:t>}</w:t>
+            </w:r>
           </w:p>
         </w:tc>
       </w:tr>
       <w:tr>
+        <w:tblPrEx>
+          <w:tblCellMar>
+            <w:top w:w="0" w:type="dxa"/>
+            <w:bottom w:w="0" w:type="dxa"/>
+          </w:tblCellMar>
+        </w:tblPrEx>
         <w:trPr>
           <w:cantSplit/>
           <w:trHeight w:val="27"/>
@@ -115,7 +197,7 @@
         </w:trPr>
         <w:tc>
           <w:tcPr>
-            <w:tcW w:w="2084" w:type="dxa"/>
+            <w:tcW w:w="2165" w:type="dxa"/>
           </w:tcPr>
           <w:p>
             <w:pPr>
@@ -123,18 +205,11 @@
               <w:jc w:val="center"/>
               <w:rPr>
                 <w:rFonts w:ascii="Arial" w:hAnsi="Arial" w:cs="Arial"/>
-                <w:sz w:val="20"/>
-              </w:rPr>
-            </w:pPr>
-            <w:r>
-              <w:rPr>
-                <w:rFonts w:ascii="Arial" w:hAnsi="Arial" w:cs="Arial"/>
                 <w:snapToGrid w:val="0"/>
                 <w:color w:val="000000"/>
                 <w:sz w:val="20"/>
               </w:rPr>
-              <w:t>File Type</w:t>
-            </w:r>
+            </w:pPr>
             <w:r>
               <w:rPr>
                 <w:rFonts w:ascii="Arial" w:hAnsi="Arial" w:cs="Arial"/>
@@ -142,13 +217,71 @@
                 <w:color w:val="000000"/>
                 <w:sz w:val="20"/>
               </w:rPr>
-              <w:t xml:space="preserve"> and number</w:t>
+              <w:t>Folder</w:t>
             </w:r>
+          </w:p>
+          <w:p>
+            <w:pPr>
+              <w:pStyle w:val="BodyText"/>
+              <w:jc w:val="center"/>
+              <w:rPr>
+                <w:rFonts w:ascii="Arial" w:hAnsi="Arial" w:cs="Arial"/>
+                <w:i/>
+                <w:snapToGrid w:val="0"/>
+                <w:color w:val="000000"/>
+                <w:sz w:val="18"/>
+                <w:szCs w:val="18"/>
+              </w:rPr>
+            </w:pPr>
+            <w:r>
+              <w:rPr>
+                <w:rFonts w:ascii="Arial" w:hAnsi="Arial" w:cs="Arial"/>
+                <w:i/>
+                <w:snapToGrid w:val="0"/>
+                <w:color w:val="000000"/>
+                <w:sz w:val="18"/>
+                <w:szCs w:val="18"/>
+              </w:rPr>
+              <w:t>(</w:t>
+            </w:r>
+            <w:proofErr w:type="spellStart"/>
+            <w:r>
+              <w:rPr>
+                <w:rFonts w:ascii="Arial" w:hAnsi="Arial" w:cs="Arial"/>
+                <w:i/>
+                <w:snapToGrid w:val="0"/>
+                <w:color w:val="000000"/>
+                <w:sz w:val="18"/>
+                <w:szCs w:val="18"/>
+              </w:rPr>
+              <w:t>eg.</w:t>
+            </w:r>
+            <w:proofErr w:type="spellEnd"/>
+            <w:r>
+              <w:rPr>
+                <w:rFonts w:ascii="Arial" w:hAnsi="Arial" w:cs="Arial"/>
+                <w:i/>
+                <w:snapToGrid w:val="0"/>
+                <w:color w:val="000000"/>
+                <w:sz w:val="18"/>
+                <w:szCs w:val="18"/>
+              </w:rPr>
+              <w:t xml:space="preserve"> RAWDAT – PRODAT – VALSRC)</w:t>
+            </w:r>
+          </w:p>
+          <w:p>
+            <w:pPr>
+              <w:pStyle w:val="BodyText"/>
+              <w:rPr>
+                <w:rFonts w:ascii="Arial" w:hAnsi="Arial" w:cs="Arial"/>
+                <w:sz w:val="20"/>
+              </w:rPr>
+            </w:pPr>
           </w:p>
         </w:tc>
         <w:tc>
           <w:tcPr>
-            <w:tcW w:w="2986" w:type="dxa"/>
+            <w:tcW w:w="2905" w:type="dxa"/>
           </w:tcPr>
           <w:p>
             <w:pPr>
@@ -164,7 +297,14 @@
                 <w:rFonts w:ascii="Arial" w:hAnsi="Arial" w:cs="Arial"/>
                 <w:sz w:val="20"/>
               </w:rPr>
-              <w:t>File</w:t>
+              <w:t>F</w:t>
+            </w:r>
+            <w:r>
+              <w:rPr>
+                <w:rFonts w:ascii="Arial" w:hAnsi="Arial" w:cs="Arial"/>
+                <w:sz w:val="20"/>
+              </w:rPr>
+              <w:t>older</w:t>
             </w:r>
             <w:r>
               <w:rPr>
@@ -186,6 +326,46 @@
                 <w:sz w:val="20"/>
               </w:rPr>
               <w:t>, File count, Folder count</w:t>
+            </w:r>
+          </w:p>
+          <w:p>
+            <w:pPr>
+              <w:pStyle w:val="BodyText"/>
+              <w:jc w:val="center"/>
+              <w:rPr>
+                <w:rFonts w:ascii="Arial" w:hAnsi="Arial" w:cs="Arial"/>
+                <w:i/>
+                <w:sz w:val="18"/>
+                <w:szCs w:val="18"/>
+              </w:rPr>
+            </w:pPr>
+            <w:r>
+              <w:rPr>
+                <w:rFonts w:ascii="Arial" w:hAnsi="Arial" w:cs="Arial"/>
+                <w:i/>
+                <w:sz w:val="18"/>
+                <w:szCs w:val="18"/>
+              </w:rPr>
+              <w:t>Size:  x bytes</w:t>
+            </w:r>
+          </w:p>
+          <w:p>
+            <w:pPr>
+              <w:pStyle w:val="BodyText"/>
+              <w:jc w:val="center"/>
+              <w:rPr>
+                <w:rFonts w:ascii="Arial" w:hAnsi="Arial" w:cs="Arial"/>
+                <w:sz w:val="20"/>
+              </w:rPr>
+            </w:pPr>
+            <w:r>
+              <w:rPr>
+                <w:rFonts w:ascii="Arial" w:hAnsi="Arial" w:cs="Arial"/>
+                <w:i/>
+                <w:sz w:val="18"/>
+                <w:szCs w:val="18"/>
+              </w:rPr>
+              <w:t>Contains:  x Files, x Folders</w:t>
             </w:r>
           </w:p>
         </w:tc>
@@ -220,13 +400,23 @@
                 <w:szCs w:val="16"/>
               </w:rPr>
             </w:pPr>
+            <w:proofErr w:type="spellStart"/>
             <w:r>
               <w:rPr>
                 <w:rFonts w:ascii="Arial" w:hAnsi="Arial" w:cs="Arial"/>
                 <w:sz w:val="16"/>
                 <w:szCs w:val="16"/>
               </w:rPr>
-              <w:t>NtM Source Assessment</w:t>
+              <w:t>NtM</w:t>
+            </w:r>
+            <w:proofErr w:type="spellEnd"/>
+            <w:r>
+              <w:rPr>
+                <w:rFonts w:ascii="Arial" w:hAnsi="Arial" w:cs="Arial"/>
+                <w:sz w:val="16"/>
+                <w:szCs w:val="16"/>
+              </w:rPr>
+              <w:t xml:space="preserve"> Source Assessment</w:t>
             </w:r>
           </w:p>
           <w:p>
@@ -329,6 +519,33 @@
               <w:jc w:val="center"/>
               <w:rPr>
                 <w:rFonts w:ascii="Arial" w:hAnsi="Arial" w:cs="Arial"/>
+                <w:i/>
+                <w:snapToGrid w:val="0"/>
+                <w:color w:val="000000"/>
+                <w:sz w:val="18"/>
+                <w:szCs w:val="18"/>
+              </w:rPr>
+            </w:pPr>
+            <w:r>
+              <w:rPr>
+                <w:rFonts w:ascii="Arial" w:hAnsi="Arial" w:cs="Arial"/>
+                <w:i/>
+                <w:snapToGrid w:val="0"/>
+                <w:color w:val="000000"/>
+                <w:sz w:val="18"/>
+                <w:szCs w:val="18"/>
+              </w:rPr>
+              <w:t>(Name)</w:t>
+            </w:r>
+          </w:p>
+          <w:p>
+            <w:pPr>
+              <w:tabs>
+                <w:tab w:val="left" w:pos="360"/>
+              </w:tabs>
+              <w:jc w:val="center"/>
+              <w:rPr>
+                <w:rFonts w:ascii="Arial" w:hAnsi="Arial" w:cs="Arial"/>
                 <w:snapToGrid w:val="0"/>
                 <w:color w:val="000000"/>
                 <w:sz w:val="16"/>
@@ -338,8 +555,11 @@
             <w:r>
               <w:rPr>
                 <w:rFonts w:ascii="Arial" w:hAnsi="Arial" w:cs="Arial"/>
+                <w:i/>
                 <w:snapToGrid w:val="0"/>
                 <w:color w:val="000000"/>
+                <w:sz w:val="18"/>
+                <w:szCs w:val="18"/>
               </w:rPr>
               <w:t>(Date)</w:t>
             </w:r>
@@ -389,6 +609,27 @@
               <w:jc w:val="center"/>
               <w:rPr>
                 <w:rFonts w:ascii="Arial" w:hAnsi="Arial" w:cs="Arial"/>
+                <w:i/>
+                <w:sz w:val="18"/>
+                <w:szCs w:val="18"/>
+              </w:rPr>
+            </w:pPr>
+            <w:r>
+              <w:rPr>
+                <w:rFonts w:ascii="Arial" w:hAnsi="Arial" w:cs="Arial"/>
+                <w:i/>
+                <w:sz w:val="18"/>
+                <w:szCs w:val="18"/>
+              </w:rPr>
+              <w:t>(Name)</w:t>
+            </w:r>
+          </w:p>
+          <w:p>
+            <w:pPr>
+              <w:pStyle w:val="BodyText"/>
+              <w:jc w:val="center"/>
+              <w:rPr>
+                <w:rFonts w:ascii="Arial" w:hAnsi="Arial" w:cs="Arial"/>
                 <w:sz w:val="16"/>
                 <w:szCs w:val="16"/>
               </w:rPr>
@@ -396,7 +637,9 @@
             <w:r>
               <w:rPr>
                 <w:rFonts w:ascii="Arial" w:hAnsi="Arial" w:cs="Arial"/>
-                <w:sz w:val="20"/>
+                <w:i/>
+                <w:sz w:val="18"/>
+                <w:szCs w:val="18"/>
               </w:rPr>
               <w:t>(Date)</w:t>
             </w:r>
@@ -404,7 +647,7 @@
         </w:tc>
         <w:tc>
           <w:tcPr>
-            <w:tcW w:w="4414" w:type="dxa"/>
+            <w:tcW w:w="4045" w:type="dxa"/>
             <w:gridSpan w:val="3"/>
           </w:tcPr>
           <w:p>
@@ -444,6 +687,12 @@
         </w:tc>
       </w:tr>
       <w:tr>
+        <w:tblPrEx>
+          <w:tblCellMar>
+            <w:top w:w="0" w:type="dxa"/>
+            <w:bottom w:w="0" w:type="dxa"/>
+          </w:tblCellMar>
+        </w:tblPrEx>
         <w:trPr>
           <w:cantSplit/>
           <w:trHeight w:val="360"/>
@@ -451,31 +700,92 @@
         </w:trPr>
         <w:tc>
           <w:tcPr>
-            <w:tcW w:w="2084" w:type="dxa"/>
+            <w:tcW w:w="2165" w:type="dxa"/>
             <w:vAlign w:val="center"/>
           </w:tcPr>
-          <w:p/>
+          <w:p>
+            <w:pPr>
+              <w:pStyle w:val="BodyText"/>
+              <w:rPr>
+                <w:rFonts w:ascii="Arial" w:hAnsi="Arial" w:cs="Arial"/>
+                <w:sz w:val="20"/>
+              </w:rPr>
+            </w:pPr>
+          </w:p>
         </w:tc>
         <w:tc>
           <w:tcPr>
-            <w:tcW w:w="2986" w:type="dxa"/>
+            <w:tcW w:w="2905" w:type="dxa"/>
             <w:vAlign w:val="center"/>
           </w:tcPr>
-          <w:p/>
+          <w:p>
+            <w:pPr>
+              <w:pStyle w:val="BodyText"/>
+              <w:rPr>
+                <w:rFonts w:ascii="Arial" w:hAnsi="Arial" w:cs="Arial"/>
+                <w:sz w:val="20"/>
+              </w:rPr>
+            </w:pPr>
+          </w:p>
+          <w:p>
+            <w:pPr>
+              <w:pStyle w:val="BodyText"/>
+              <w:rPr>
+                <w:rFonts w:ascii="Arial" w:hAnsi="Arial" w:cs="Arial"/>
+                <w:sz w:val="20"/>
+              </w:rPr>
+            </w:pPr>
+          </w:p>
+          <w:p>
+            <w:pPr>
+              <w:pStyle w:val="BodyText"/>
+              <w:rPr>
+                <w:rFonts w:ascii="Arial" w:hAnsi="Arial" w:cs="Arial"/>
+                <w:sz w:val="20"/>
+              </w:rPr>
+            </w:pPr>
+          </w:p>
+          <w:p>
+            <w:pPr>
+              <w:pStyle w:val="BodyText"/>
+              <w:rPr>
+                <w:rFonts w:ascii="Arial" w:hAnsi="Arial" w:cs="Arial"/>
+                <w:sz w:val="20"/>
+              </w:rPr>
+            </w:pPr>
+          </w:p>
         </w:tc>
         <w:tc>
           <w:tcPr>
             <w:tcW w:w="1275" w:type="dxa"/>
             <w:vAlign w:val="center"/>
           </w:tcPr>
-          <w:p/>
+          <w:p>
+            <w:pPr>
+              <w:pStyle w:val="BodyText"/>
+              <w:jc w:val="center"/>
+              <w:rPr>
+                <w:rFonts w:ascii="Arial" w:hAnsi="Arial" w:cs="Arial"/>
+                <w:sz w:val="20"/>
+              </w:rPr>
+            </w:pPr>
+          </w:p>
         </w:tc>
         <w:tc>
           <w:tcPr>
             <w:tcW w:w="1418" w:type="dxa"/>
             <w:vAlign w:val="center"/>
           </w:tcPr>
-          <w:p/>
+          <w:p>
+            <w:pPr>
+              <w:pStyle w:val="BodyText"/>
+              <w:jc w:val="center"/>
+              <w:rPr>
+                <w:rFonts w:ascii="Arial" w:hAnsi="Arial" w:cs="Arial"/>
+                <w:sz w:val="20"/>
+              </w:rPr>
+            </w:pPr>
+          </w:p>
         </w:tc>
         <w:tc>
           <w:tcPr>
@@ -495,7 +805,7 @@
         </w:tc>
         <w:tc>
           <w:tcPr>
-            <w:tcW w:w="4414" w:type="dxa"/>
+            <w:tcW w:w="4045" w:type="dxa"/>
             <w:gridSpan w:val="3"/>
             <w:vAlign w:val="center"/>
           </w:tcPr>
@@ -512,6 +822,12 @@
         </w:tc>
       </w:tr>
       <w:tr>
+        <w:tblPrEx>
+          <w:tblCellMar>
+            <w:top w:w="0" w:type="dxa"/>
+            <w:bottom w:w="0" w:type="dxa"/>
+          </w:tblCellMar>
+        </w:tblPrEx>
         <w:trPr>
           <w:cantSplit/>
           <w:trHeight w:val="360"/>
@@ -519,31 +835,83 @@
         </w:trPr>
         <w:tc>
           <w:tcPr>
-            <w:tcW w:w="2084" w:type="dxa"/>
+            <w:tcW w:w="2165" w:type="dxa"/>
             <w:vAlign w:val="center"/>
           </w:tcPr>
-          <w:p/>
+          <w:p>
+            <w:pPr>
+              <w:pStyle w:val="BodyText"/>
+              <w:rPr>
+                <w:rFonts w:ascii="Arial" w:hAnsi="Arial" w:cs="Arial"/>
+                <w:sz w:val="20"/>
+              </w:rPr>
+            </w:pPr>
+          </w:p>
         </w:tc>
         <w:tc>
           <w:tcPr>
-            <w:tcW w:w="2986" w:type="dxa"/>
+            <w:tcW w:w="2905" w:type="dxa"/>
             <w:vAlign w:val="center"/>
           </w:tcPr>
-          <w:p/>
+          <w:p>
+            <w:pPr>
+              <w:pStyle w:val="BodyText"/>
+              <w:rPr>
+                <w:rFonts w:ascii="Arial" w:hAnsi="Arial" w:cs="Arial"/>
+                <w:sz w:val="20"/>
+              </w:rPr>
+            </w:pPr>
+          </w:p>
+          <w:p>
+            <w:pPr>
+              <w:pStyle w:val="BodyText"/>
+              <w:rPr>
+                <w:rFonts w:ascii="Arial" w:hAnsi="Arial" w:cs="Arial"/>
+                <w:sz w:val="20"/>
+              </w:rPr>
+            </w:pPr>
+          </w:p>
+          <w:p>
+            <w:pPr>
+              <w:pStyle w:val="BodyText"/>
+              <w:rPr>
+                <w:rFonts w:ascii="Arial" w:hAnsi="Arial" w:cs="Arial"/>
+                <w:sz w:val="20"/>
+              </w:rPr>
+            </w:pPr>
+          </w:p>
         </w:tc>
         <w:tc>
           <w:tcPr>
             <w:tcW w:w="1275" w:type="dxa"/>
             <w:vAlign w:val="center"/>
           </w:tcPr>
-          <w:p/>
+          <w:p>
+            <w:pPr>
+              <w:pStyle w:val="BodyText"/>
+              <w:jc w:val="center"/>
+              <w:rPr>
+                <w:rFonts w:ascii="Arial" w:hAnsi="Arial" w:cs="Arial"/>
+                <w:sz w:val="20"/>
+              </w:rPr>
+            </w:pPr>
+          </w:p>
         </w:tc>
         <w:tc>
           <w:tcPr>
             <w:tcW w:w="1418" w:type="dxa"/>
             <w:vAlign w:val="center"/>
           </w:tcPr>
-          <w:p/>
+          <w:p>
+            <w:pPr>
+              <w:pStyle w:val="BodyText"/>
+              <w:jc w:val="center"/>
+              <w:rPr>
+                <w:rFonts w:ascii="Arial" w:hAnsi="Arial" w:cs="Arial"/>
+                <w:sz w:val="20"/>
+              </w:rPr>
+            </w:pPr>
+          </w:p>
         </w:tc>
         <w:tc>
           <w:tcPr>
@@ -563,13 +931,14 @@
         </w:tc>
         <w:tc>
           <w:tcPr>
-            <w:tcW w:w="4414" w:type="dxa"/>
+            <w:tcW w:w="4045" w:type="dxa"/>
             <w:gridSpan w:val="3"/>
             <w:vAlign w:val="center"/>
           </w:tcPr>
           <w:p>
             <w:pPr>
               <w:pStyle w:val="BodyText"/>
+              <w:ind w:right="348"/>
               <w:rPr>
                 <w:rFonts w:ascii="Arial" w:hAnsi="Arial" w:cs="Arial"/>
                 <w:sz w:val="20"/>
@@ -579,6 +948,12 @@
         </w:tc>
       </w:tr>
       <w:tr>
+        <w:tblPrEx>
+          <w:tblCellMar>
+            <w:top w:w="0" w:type="dxa"/>
+            <w:bottom w:w="0" w:type="dxa"/>
+          </w:tblCellMar>
+        </w:tblPrEx>
         <w:trPr>
           <w:cantSplit/>
           <w:trHeight w:val="360"/>
@@ -586,31 +961,92 @@
         </w:trPr>
         <w:tc>
           <w:tcPr>
-            <w:tcW w:w="2084" w:type="dxa"/>
+            <w:tcW w:w="2165" w:type="dxa"/>
             <w:vAlign w:val="center"/>
           </w:tcPr>
-          <w:p/>
+          <w:p>
+            <w:pPr>
+              <w:pStyle w:val="BodyText"/>
+              <w:rPr>
+                <w:rFonts w:ascii="Arial" w:hAnsi="Arial" w:cs="Arial"/>
+                <w:sz w:val="20"/>
+              </w:rPr>
+            </w:pPr>
+          </w:p>
         </w:tc>
         <w:tc>
           <w:tcPr>
-            <w:tcW w:w="2986" w:type="dxa"/>
+            <w:tcW w:w="2905" w:type="dxa"/>
             <w:vAlign w:val="center"/>
           </w:tcPr>
-          <w:p/>
+          <w:p>
+            <w:pPr>
+              <w:pStyle w:val="BodyText"/>
+              <w:rPr>
+                <w:rFonts w:ascii="Arial" w:hAnsi="Arial" w:cs="Arial"/>
+                <w:sz w:val="20"/>
+              </w:rPr>
+            </w:pPr>
+          </w:p>
+          <w:p>
+            <w:pPr>
+              <w:pStyle w:val="BodyText"/>
+              <w:rPr>
+                <w:rFonts w:ascii="Arial" w:hAnsi="Arial" w:cs="Arial"/>
+                <w:sz w:val="20"/>
+              </w:rPr>
+            </w:pPr>
+          </w:p>
+          <w:p>
+            <w:pPr>
+              <w:pStyle w:val="BodyText"/>
+              <w:rPr>
+                <w:rFonts w:ascii="Arial" w:hAnsi="Arial" w:cs="Arial"/>
+                <w:sz w:val="20"/>
+              </w:rPr>
+            </w:pPr>
+          </w:p>
+          <w:p>
+            <w:pPr>
+              <w:pStyle w:val="BodyText"/>
+              <w:rPr>
+                <w:rFonts w:ascii="Arial" w:hAnsi="Arial" w:cs="Arial"/>
+                <w:sz w:val="20"/>
+              </w:rPr>
+            </w:pPr>
+          </w:p>
         </w:tc>
         <w:tc>
           <w:tcPr>
             <w:tcW w:w="1275" w:type="dxa"/>
             <w:vAlign w:val="center"/>
           </w:tcPr>
-          <w:p/>
+          <w:p>
+            <w:pPr>
+              <w:pStyle w:val="BodyText"/>
+              <w:jc w:val="center"/>
+              <w:rPr>
+                <w:rFonts w:ascii="Arial" w:hAnsi="Arial" w:cs="Arial"/>
+                <w:sz w:val="20"/>
+              </w:rPr>
+            </w:pPr>
+          </w:p>
         </w:tc>
         <w:tc>
           <w:tcPr>
             <w:tcW w:w="1418" w:type="dxa"/>
             <w:vAlign w:val="center"/>
           </w:tcPr>
-          <w:p/>
+          <w:p>
+            <w:pPr>
+              <w:pStyle w:val="BodyText"/>
+              <w:jc w:val="center"/>
+              <w:rPr>
+                <w:rFonts w:ascii="Arial" w:hAnsi="Arial" w:cs="Arial"/>
+                <w:sz w:val="20"/>
+              </w:rPr>
+            </w:pPr>
+          </w:p>
         </w:tc>
         <w:tc>
           <w:tcPr>
@@ -630,7 +1066,7 @@
         </w:tc>
         <w:tc>
           <w:tcPr>
-            <w:tcW w:w="4414" w:type="dxa"/>
+            <w:tcW w:w="4045" w:type="dxa"/>
             <w:gridSpan w:val="3"/>
             <w:vAlign w:val="center"/>
           </w:tcPr>
@@ -646,6 +1082,12 @@
         </w:tc>
       </w:tr>
       <w:tr>
+        <w:tblPrEx>
+          <w:tblCellMar>
+            <w:top w:w="0" w:type="dxa"/>
+            <w:bottom w:w="0" w:type="dxa"/>
+          </w:tblCellMar>
+        </w:tblPrEx>
         <w:trPr>
           <w:cantSplit/>
           <w:trHeight w:val="360"/>
@@ -653,7 +1095,7 @@
         </w:trPr>
         <w:tc>
           <w:tcPr>
-            <w:tcW w:w="2084" w:type="dxa"/>
+            <w:tcW w:w="2165" w:type="dxa"/>
             <w:vAlign w:val="center"/>
           </w:tcPr>
           <w:p>
@@ -668,9 +1110,27 @@
         </w:tc>
         <w:tc>
           <w:tcPr>
-            <w:tcW w:w="2986" w:type="dxa"/>
+            <w:tcW w:w="2905" w:type="dxa"/>
             <w:vAlign w:val="center"/>
           </w:tcPr>
+          <w:p>
+            <w:pPr>
+              <w:pStyle w:val="BodyText"/>
+              <w:rPr>
+                <w:rFonts w:ascii="Arial" w:hAnsi="Arial" w:cs="Arial"/>
+                <w:sz w:val="20"/>
+              </w:rPr>
+            </w:pPr>
+          </w:p>
+          <w:p>
+            <w:pPr>
+              <w:pStyle w:val="BodyText"/>
+              <w:rPr>
+                <w:rFonts w:ascii="Arial" w:hAnsi="Arial" w:cs="Arial"/>
+                <w:sz w:val="20"/>
+              </w:rPr>
+            </w:pPr>
+          </w:p>
           <w:p>
             <w:pPr>
               <w:pStyle w:val="BodyText"/>
@@ -731,7 +1191,7 @@
         </w:tc>
         <w:tc>
           <w:tcPr>
-            <w:tcW w:w="4414" w:type="dxa"/>
+            <w:tcW w:w="4045" w:type="dxa"/>
             <w:gridSpan w:val="3"/>
             <w:vAlign w:val="center"/>
           </w:tcPr>
@@ -747,6 +1207,12 @@
         </w:tc>
       </w:tr>
       <w:tr>
+        <w:tblPrEx>
+          <w:tblCellMar>
+            <w:top w:w="0" w:type="dxa"/>
+            <w:bottom w:w="0" w:type="dxa"/>
+          </w:tblCellMar>
+        </w:tblPrEx>
         <w:trPr>
           <w:cantSplit/>
           <w:trHeight w:val="360"/>
@@ -754,7 +1220,8 @@
         </w:trPr>
         <w:tc>
           <w:tcPr>
-            <w:tcW w:w="2084" w:type="dxa"/>
+            <w:tcW w:w="13509" w:type="dxa"/>
+            <w:gridSpan w:val="8"/>
             <w:vAlign w:val="center"/>
           </w:tcPr>
           <w:p>
@@ -765,13 +1232,14 @@
                 <w:sz w:val="20"/>
               </w:rPr>
             </w:pPr>
-          </w:p>
-        </w:tc>
-        <w:tc>
-          <w:tcPr>
-            <w:tcW w:w="2986" w:type="dxa"/>
-            <w:vAlign w:val="center"/>
-          </w:tcPr>
+            <w:r>
+              <w:rPr>
+                <w:rFonts w:ascii="Arial" w:hAnsi="Arial" w:cs="Arial"/>
+                <w:sz w:val="20"/>
+              </w:rPr>
+              <w:t>Additional Submission Notes:</w:t>
+            </w:r>
+          </w:p>
           <w:p>
             <w:pPr>
               <w:pStyle w:val="BodyText"/>
@@ -781,61 +1249,15 @@
               </w:rPr>
             </w:pPr>
           </w:p>
-        </w:tc>
-        <w:tc>
-          <w:tcPr>
-            <w:tcW w:w="1275" w:type="dxa"/>
-            <w:vAlign w:val="center"/>
-          </w:tcPr>
           <w:p>
             <w:pPr>
               <w:pStyle w:val="BodyText"/>
-              <w:jc w:val="center"/>
-              <w:rPr>
-                <w:rFonts w:ascii="Arial" w:hAnsi="Arial" w:cs="Arial"/>
-                <w:sz w:val="20"/>
-              </w:rPr>
-            </w:pPr>
-          </w:p>
-        </w:tc>
-        <w:tc>
-          <w:tcPr>
-            <w:tcW w:w="1418" w:type="dxa"/>
-            <w:vAlign w:val="center"/>
-          </w:tcPr>
-          <w:p>
-            <w:pPr>
-              <w:pStyle w:val="BodyText"/>
-              <w:jc w:val="center"/>
-              <w:rPr>
-                <w:rFonts w:ascii="Arial" w:hAnsi="Arial" w:cs="Arial"/>
-                <w:sz w:val="20"/>
-              </w:rPr>
-            </w:pPr>
-          </w:p>
-        </w:tc>
-        <w:tc>
-          <w:tcPr>
-            <w:tcW w:w="1701" w:type="dxa"/>
-            <w:vAlign w:val="center"/>
-          </w:tcPr>
-          <w:p>
-            <w:pPr>
-              <w:pStyle w:val="BodyText"/>
-              <w:jc w:val="center"/>
-              <w:rPr>
-                <w:rFonts w:ascii="Arial" w:hAnsi="Arial" w:cs="Arial"/>
-                <w:sz w:val="20"/>
-              </w:rPr>
-            </w:pPr>
-          </w:p>
-        </w:tc>
-        <w:tc>
-          <w:tcPr>
-            <w:tcW w:w="4414" w:type="dxa"/>
-            <w:gridSpan w:val="3"/>
-            <w:vAlign w:val="center"/>
-          </w:tcPr>
+              <w:rPr>
+                <w:rFonts w:ascii="Arial" w:hAnsi="Arial" w:cs="Arial"/>
+                <w:sz w:val="20"/>
+              </w:rPr>
+            </w:pPr>
+          </w:p>
           <w:p>
             <w:pPr>
               <w:pStyle w:val="BodyText"/>
@@ -848,483 +1270,174 @@
         </w:tc>
       </w:tr>
       <w:tr>
-        <w:trPr>
-          <w:cantSplit/>
-          <w:trHeight w:val="360"/>
-          <w:jc w:val="center"/>
-        </w:trPr>
-        <w:tc>
-          <w:tcPr>
-            <w:tcW w:w="2084" w:type="dxa"/>
-            <w:vAlign w:val="center"/>
-          </w:tcPr>
-          <w:p>
-            <w:pPr>
-              <w:pStyle w:val="BodyText"/>
-              <w:rPr>
-                <w:rFonts w:ascii="Arial" w:hAnsi="Arial" w:cs="Arial"/>
-                <w:sz w:val="20"/>
-              </w:rPr>
-            </w:pPr>
-          </w:p>
-        </w:tc>
-        <w:tc>
-          <w:tcPr>
-            <w:tcW w:w="2986" w:type="dxa"/>
-            <w:vAlign w:val="center"/>
-          </w:tcPr>
-          <w:p>
-            <w:pPr>
-              <w:pStyle w:val="BodyText"/>
-              <w:rPr>
-                <w:rFonts w:ascii="Arial" w:hAnsi="Arial" w:cs="Arial"/>
-                <w:sz w:val="20"/>
-              </w:rPr>
-            </w:pPr>
-          </w:p>
-        </w:tc>
-        <w:tc>
-          <w:tcPr>
-            <w:tcW w:w="1275" w:type="dxa"/>
-            <w:vAlign w:val="center"/>
-          </w:tcPr>
-          <w:p>
-            <w:pPr>
-              <w:pStyle w:val="BodyText"/>
-              <w:jc w:val="center"/>
-              <w:rPr>
-                <w:rFonts w:ascii="Arial" w:hAnsi="Arial" w:cs="Arial"/>
-                <w:sz w:val="20"/>
-              </w:rPr>
-            </w:pPr>
-          </w:p>
-        </w:tc>
-        <w:tc>
-          <w:tcPr>
-            <w:tcW w:w="1418" w:type="dxa"/>
-            <w:vAlign w:val="center"/>
-          </w:tcPr>
-          <w:p>
-            <w:pPr>
-              <w:pStyle w:val="BodyText"/>
-              <w:jc w:val="center"/>
-              <w:rPr>
-                <w:rFonts w:ascii="Arial" w:hAnsi="Arial" w:cs="Arial"/>
-                <w:sz w:val="20"/>
-              </w:rPr>
-            </w:pPr>
-          </w:p>
-        </w:tc>
-        <w:tc>
-          <w:tcPr>
-            <w:tcW w:w="1701" w:type="dxa"/>
-            <w:vAlign w:val="center"/>
-          </w:tcPr>
-          <w:p>
-            <w:pPr>
-              <w:pStyle w:val="BodyText"/>
-              <w:jc w:val="center"/>
-              <w:rPr>
-                <w:rFonts w:ascii="Arial" w:hAnsi="Arial" w:cs="Arial"/>
-                <w:sz w:val="20"/>
-              </w:rPr>
-            </w:pPr>
-          </w:p>
-        </w:tc>
-        <w:tc>
-          <w:tcPr>
-            <w:tcW w:w="4414" w:type="dxa"/>
-            <w:gridSpan w:val="3"/>
-            <w:vAlign w:val="center"/>
-          </w:tcPr>
-          <w:p>
-            <w:pPr>
-              <w:pStyle w:val="BodyText"/>
-              <w:rPr>
-                <w:rFonts w:ascii="Arial" w:hAnsi="Arial" w:cs="Arial"/>
-                <w:sz w:val="20"/>
-              </w:rPr>
-            </w:pPr>
-          </w:p>
-        </w:tc>
-      </w:tr>
-      <w:tr>
-        <w:trPr>
-          <w:cantSplit/>
-          <w:trHeight w:val="360"/>
-          <w:jc w:val="center"/>
-        </w:trPr>
-        <w:tc>
-          <w:tcPr>
-            <w:tcW w:w="2084" w:type="dxa"/>
-            <w:vAlign w:val="center"/>
-          </w:tcPr>
-          <w:p>
-            <w:pPr>
-              <w:pStyle w:val="BodyText"/>
-              <w:rPr>
-                <w:rFonts w:ascii="Arial" w:hAnsi="Arial" w:cs="Arial"/>
-                <w:sz w:val="20"/>
-              </w:rPr>
-            </w:pPr>
-          </w:p>
-        </w:tc>
-        <w:tc>
-          <w:tcPr>
-            <w:tcW w:w="2986" w:type="dxa"/>
-            <w:vAlign w:val="center"/>
-          </w:tcPr>
-          <w:p>
-            <w:pPr>
-              <w:pStyle w:val="BodyText"/>
-              <w:rPr>
-                <w:rFonts w:ascii="Arial" w:hAnsi="Arial" w:cs="Arial"/>
-                <w:sz w:val="20"/>
-              </w:rPr>
-            </w:pPr>
-          </w:p>
-        </w:tc>
-        <w:tc>
-          <w:tcPr>
-            <w:tcW w:w="1275" w:type="dxa"/>
-            <w:vAlign w:val="center"/>
-          </w:tcPr>
-          <w:p>
-            <w:pPr>
-              <w:pStyle w:val="BodyText"/>
-              <w:jc w:val="center"/>
-              <w:rPr>
-                <w:rFonts w:ascii="Arial" w:hAnsi="Arial" w:cs="Arial"/>
-                <w:sz w:val="20"/>
-              </w:rPr>
-            </w:pPr>
-          </w:p>
-        </w:tc>
-        <w:tc>
-          <w:tcPr>
-            <w:tcW w:w="1418" w:type="dxa"/>
-            <w:vAlign w:val="center"/>
-          </w:tcPr>
-          <w:p>
-            <w:pPr>
-              <w:pStyle w:val="BodyText"/>
-              <w:jc w:val="center"/>
-              <w:rPr>
-                <w:rFonts w:ascii="Arial" w:hAnsi="Arial" w:cs="Arial"/>
-                <w:sz w:val="20"/>
-              </w:rPr>
-            </w:pPr>
-          </w:p>
-        </w:tc>
-        <w:tc>
-          <w:tcPr>
-            <w:tcW w:w="1701" w:type="dxa"/>
-            <w:vAlign w:val="center"/>
-          </w:tcPr>
-          <w:p>
-            <w:pPr>
-              <w:pStyle w:val="BodyText"/>
-              <w:jc w:val="center"/>
-              <w:rPr>
-                <w:rFonts w:ascii="Arial" w:hAnsi="Arial" w:cs="Arial"/>
-                <w:sz w:val="20"/>
-              </w:rPr>
-            </w:pPr>
-          </w:p>
-        </w:tc>
-        <w:tc>
-          <w:tcPr>
-            <w:tcW w:w="4414" w:type="dxa"/>
-            <w:gridSpan w:val="3"/>
-            <w:vAlign w:val="center"/>
-          </w:tcPr>
-          <w:p>
-            <w:pPr>
-              <w:pStyle w:val="BodyText"/>
-              <w:rPr>
-                <w:rFonts w:ascii="Arial" w:hAnsi="Arial" w:cs="Arial"/>
-                <w:sz w:val="20"/>
-              </w:rPr>
-            </w:pPr>
-          </w:p>
-        </w:tc>
-      </w:tr>
-      <w:tr>
-        <w:trPr>
-          <w:cantSplit/>
-          <w:trHeight w:val="360"/>
-          <w:jc w:val="center"/>
-        </w:trPr>
-        <w:tc>
-          <w:tcPr>
-            <w:tcW w:w="2084" w:type="dxa"/>
-            <w:vAlign w:val="center"/>
-          </w:tcPr>
-          <w:p>
-            <w:pPr>
-              <w:pStyle w:val="BodyText"/>
-              <w:rPr>
-                <w:rFonts w:ascii="Arial" w:hAnsi="Arial" w:cs="Arial"/>
-                <w:sz w:val="20"/>
-              </w:rPr>
-            </w:pPr>
-          </w:p>
-        </w:tc>
-        <w:tc>
-          <w:tcPr>
-            <w:tcW w:w="2986" w:type="dxa"/>
-            <w:vAlign w:val="center"/>
-          </w:tcPr>
-          <w:p>
-            <w:pPr>
-              <w:pStyle w:val="BodyText"/>
-              <w:rPr>
-                <w:rFonts w:ascii="Arial" w:hAnsi="Arial" w:cs="Arial"/>
-                <w:sz w:val="20"/>
-              </w:rPr>
-            </w:pPr>
-          </w:p>
-        </w:tc>
-        <w:tc>
-          <w:tcPr>
-            <w:tcW w:w="1275" w:type="dxa"/>
-            <w:vAlign w:val="center"/>
-          </w:tcPr>
-          <w:p>
-            <w:pPr>
-              <w:pStyle w:val="BodyText"/>
-              <w:jc w:val="center"/>
-              <w:rPr>
-                <w:rFonts w:ascii="Arial" w:hAnsi="Arial" w:cs="Arial"/>
-                <w:sz w:val="20"/>
-              </w:rPr>
-            </w:pPr>
-          </w:p>
-        </w:tc>
-        <w:tc>
-          <w:tcPr>
-            <w:tcW w:w="1418" w:type="dxa"/>
-            <w:vAlign w:val="center"/>
-          </w:tcPr>
-          <w:p>
-            <w:pPr>
-              <w:pStyle w:val="BodyText"/>
-              <w:jc w:val="center"/>
-              <w:rPr>
-                <w:rFonts w:ascii="Arial" w:hAnsi="Arial" w:cs="Arial"/>
-                <w:sz w:val="20"/>
-              </w:rPr>
-            </w:pPr>
-          </w:p>
-        </w:tc>
-        <w:tc>
-          <w:tcPr>
-            <w:tcW w:w="1701" w:type="dxa"/>
-            <w:vAlign w:val="center"/>
-          </w:tcPr>
-          <w:p>
-            <w:pPr>
-              <w:pStyle w:val="BodyText"/>
-              <w:jc w:val="center"/>
-              <w:rPr>
-                <w:rFonts w:ascii="Arial" w:hAnsi="Arial" w:cs="Arial"/>
-                <w:sz w:val="20"/>
-              </w:rPr>
-            </w:pPr>
-          </w:p>
-        </w:tc>
-        <w:tc>
-          <w:tcPr>
-            <w:tcW w:w="4414" w:type="dxa"/>
-            <w:gridSpan w:val="3"/>
-            <w:vAlign w:val="center"/>
-          </w:tcPr>
-          <w:p>
-            <w:pPr>
-              <w:pStyle w:val="BodyText"/>
-              <w:rPr>
-                <w:rFonts w:ascii="Arial" w:hAnsi="Arial" w:cs="Arial"/>
-                <w:sz w:val="20"/>
-              </w:rPr>
-            </w:pPr>
-          </w:p>
-        </w:tc>
-      </w:tr>
-      <w:tr>
-        <w:trPr>
-          <w:cantSplit/>
-          <w:trHeight w:val="360"/>
-          <w:jc w:val="center"/>
-        </w:trPr>
-        <w:tc>
-          <w:tcPr>
-            <w:tcW w:w="2084" w:type="dxa"/>
-            <w:vAlign w:val="center"/>
-          </w:tcPr>
-          <w:p>
-            <w:pPr>
-              <w:pStyle w:val="BodyText"/>
-              <w:rPr>
-                <w:rFonts w:ascii="Arial" w:hAnsi="Arial" w:cs="Arial"/>
-                <w:sz w:val="20"/>
-              </w:rPr>
-            </w:pPr>
-            <w:bookmarkStart w:id="0" w:name="_GoBack"/>
-          </w:p>
-        </w:tc>
-        <w:tc>
-          <w:tcPr>
-            <w:tcW w:w="2986" w:type="dxa"/>
-            <w:vAlign w:val="center"/>
-          </w:tcPr>
-          <w:p>
-            <w:pPr>
-              <w:pStyle w:val="BodyText"/>
-              <w:rPr>
-                <w:rFonts w:ascii="Arial" w:hAnsi="Arial" w:cs="Arial"/>
-                <w:sz w:val="20"/>
-              </w:rPr>
-            </w:pPr>
-          </w:p>
-        </w:tc>
-        <w:tc>
-          <w:tcPr>
-            <w:tcW w:w="1275" w:type="dxa"/>
-            <w:vAlign w:val="center"/>
-          </w:tcPr>
-          <w:p>
-            <w:pPr>
-              <w:pStyle w:val="BodyText"/>
-              <w:jc w:val="center"/>
-              <w:rPr>
-                <w:rFonts w:ascii="Arial" w:hAnsi="Arial" w:cs="Arial"/>
-                <w:sz w:val="20"/>
-              </w:rPr>
-            </w:pPr>
-          </w:p>
-        </w:tc>
-        <w:tc>
-          <w:tcPr>
-            <w:tcW w:w="1418" w:type="dxa"/>
-            <w:vAlign w:val="center"/>
-          </w:tcPr>
-          <w:p>
-            <w:pPr>
-              <w:pStyle w:val="BodyText"/>
-              <w:jc w:val="center"/>
-              <w:rPr>
-                <w:rFonts w:ascii="Arial" w:hAnsi="Arial" w:cs="Arial"/>
-                <w:sz w:val="20"/>
-              </w:rPr>
-            </w:pPr>
-          </w:p>
-        </w:tc>
-        <w:tc>
-          <w:tcPr>
-            <w:tcW w:w="1701" w:type="dxa"/>
-            <w:vAlign w:val="center"/>
-          </w:tcPr>
-          <w:p>
-            <w:pPr>
-              <w:pStyle w:val="BodyText"/>
-              <w:jc w:val="center"/>
-              <w:rPr>
-                <w:rFonts w:ascii="Arial" w:hAnsi="Arial" w:cs="Arial"/>
-                <w:sz w:val="20"/>
-              </w:rPr>
-            </w:pPr>
-          </w:p>
-        </w:tc>
-        <w:tc>
-          <w:tcPr>
-            <w:tcW w:w="4414" w:type="dxa"/>
-            <w:gridSpan w:val="3"/>
-            <w:vAlign w:val="center"/>
-          </w:tcPr>
-          <w:p>
-            <w:pPr>
-              <w:pStyle w:val="BodyText"/>
-              <w:rPr>
-                <w:rFonts w:ascii="Arial" w:hAnsi="Arial" w:cs="Arial"/>
-                <w:sz w:val="20"/>
-              </w:rPr>
-            </w:pPr>
-          </w:p>
-        </w:tc>
-      </w:tr>
-      <w:bookmarkEnd w:id="0"/>
-    </w:tbl>
-    <w:p>
-      <w:pPr>
-        <w:tabs>
-          <w:tab w:val="left" w:pos="360"/>
-        </w:tabs>
-        <w:rPr>
-          <w:rFonts w:ascii="Arial" w:hAnsi="Arial" w:cs="Arial"/>
-        </w:rPr>
-      </w:pPr>
-    </w:p>
-    <w:p>
-      <w:pPr>
-        <w:tabs>
-          <w:tab w:val="left" w:pos="360"/>
-        </w:tabs>
-        <w:rPr>
-          <w:rFonts w:ascii="Arial" w:hAnsi="Arial" w:cs="Arial"/>
-          <w:snapToGrid w:val="0"/>
-          <w:color w:val="000000"/>
-          <w:sz w:val="24"/>
-        </w:rPr>
-      </w:pPr>
-    </w:p>
-    <w:tbl>
-      <w:tblPr>
-        <w:tblW w:w="0" w:type="auto"/>
-        <w:tblBorders>
-          <w:top w:val="single" w:sz="4" w:space="0" w:color="auto"/>
-          <w:left w:val="single" w:sz="4" w:space="0" w:color="auto"/>
-          <w:bottom w:val="single" w:sz="4" w:space="0" w:color="auto"/>
-          <w:right w:val="single" w:sz="4" w:space="0" w:color="auto"/>
-          <w:insideH w:val="single" w:sz="4" w:space="0" w:color="auto"/>
-          <w:insideV w:val="single" w:sz="4" w:space="0" w:color="auto"/>
-        </w:tblBorders>
-        <w:tblLayout w:type="fixed"/>
-        <w:tblLook w:val="0000" w:firstRow="0" w:lastRow="0" w:firstColumn="0" w:lastColumn="0" w:noHBand="0" w:noVBand="0"/>
-      </w:tblPr>
-      <w:tblGrid>
-        <w:gridCol w:w="10314"/>
-        <w:gridCol w:w="3582"/>
-      </w:tblGrid>
-      <w:tr>
+        <w:tblPrEx>
+          <w:jc w:val="left"/>
+          <w:tblCellMar>
+            <w:top w:w="0" w:type="dxa"/>
+            <w:bottom w:w="0" w:type="dxa"/>
+          </w:tblCellMar>
+        </w:tblPrEx>
         <w:trPr>
           <w:trHeight w:val="576"/>
         </w:trPr>
         <w:tc>
           <w:tcPr>
-            <w:tcW w:w="10314" w:type="dxa"/>
+            <w:tcW w:w="10116" w:type="dxa"/>
+            <w:gridSpan w:val="6"/>
             <w:vAlign w:val="center"/>
           </w:tcPr>
           <w:p>
+            <w:pPr>
+              <w:tabs>
+                <w:tab w:val="left" w:pos="360"/>
+              </w:tabs>
+              <w:rPr>
+                <w:rFonts w:ascii="Arial" w:hAnsi="Arial" w:cs="Arial"/>
+                <w:snapToGrid w:val="0"/>
+                <w:color w:val="000000"/>
+                <w:u w:val="single"/>
+              </w:rPr>
+            </w:pPr>
             <w:r>
-              <w:t>Submission verified by Hydrographer in Charge :</w:t>
+              <w:rPr>
+                <w:rFonts w:ascii="Arial" w:hAnsi="Arial" w:cs="Arial"/>
+                <w:snapToGrid w:val="0"/>
+                <w:color w:val="000000"/>
+              </w:rPr>
+              <w:t>Submission verified by Hydrographer in Charge</w:t>
+            </w:r>
+            <w:r>
+              <w:rPr>
+                <w:rFonts w:ascii="Arial" w:hAnsi="Arial" w:cs="Arial"/>
+                <w:snapToGrid w:val="0"/>
+                <w:color w:val="000000"/>
+              </w:rPr>
+              <w:t xml:space="preserve"> (</w:t>
+            </w:r>
+            <w:r>
+              <w:rPr>
+                <w:rFonts w:ascii="Arial" w:hAnsi="Arial" w:cs="Arial"/>
+                <w:i/>
+                <w:snapToGrid w:val="0"/>
+                <w:color w:val="000000"/>
+              </w:rPr>
+              <w:t>insert full name</w:t>
+            </w:r>
+            <w:r>
+              <w:rPr>
+                <w:rFonts w:ascii="Arial" w:hAnsi="Arial" w:cs="Arial"/>
+                <w:snapToGrid w:val="0"/>
+                <w:color w:val="000000"/>
+              </w:rPr>
+              <w:t>)</w:t>
+            </w:r>
+            <w:r>
+              <w:rPr>
+                <w:rFonts w:ascii="Arial" w:hAnsi="Arial" w:cs="Arial"/>
+                <w:snapToGrid w:val="0"/>
+                <w:color w:val="000000"/>
+              </w:rPr>
+              <w:t xml:space="preserve">: </w:t>
+            </w:r>
+            <w:r>
+              <w:rPr>
+                <w:rFonts w:ascii="Arial" w:hAnsi="Arial" w:cs="Arial"/>
+                <w:snapToGrid w:val="0"/>
+                <w:color w:val="000000"/>
+                <w:u w:val="single"/>
+              </w:rPr>
+              <w:t xml:space="preserve">                                                                                        </w:t>
             </w:r>
           </w:p>
         </w:tc>
         <w:tc>
           <w:tcPr>
-            <w:tcW w:w="3582" w:type="dxa"/>
+            <w:tcW w:w="3384" w:type="dxa"/>
+            <w:gridSpan w:val="2"/>
             <w:vAlign w:val="center"/>
           </w:tcPr>
-          <w:p/>
+          <w:p>
+            <w:pPr>
+              <w:tabs>
+                <w:tab w:val="left" w:pos="360"/>
+              </w:tabs>
+              <w:rPr>
+                <w:rFonts w:ascii="Arial" w:hAnsi="Arial" w:cs="Arial"/>
+                <w:snapToGrid w:val="0"/>
+                <w:color w:val="000000"/>
+              </w:rPr>
+            </w:pPr>
+            <w:r>
+              <w:rPr>
+                <w:rFonts w:ascii="Arial" w:hAnsi="Arial" w:cs="Arial"/>
+                <w:snapToGrid w:val="0"/>
+                <w:color w:val="000000"/>
+              </w:rPr>
+              <w:t>Date</w:t>
+            </w:r>
+            <w:r>
+              <w:rPr>
+                <w:rFonts w:ascii="Arial" w:hAnsi="Arial" w:cs="Arial"/>
+                <w:snapToGrid w:val="0"/>
+                <w:color w:val="000000"/>
+              </w:rPr>
+              <w:t>:</w:t>
+            </w:r>
+          </w:p>
+          <w:p>
+            <w:pPr>
+              <w:tabs>
+                <w:tab w:val="left" w:pos="360"/>
+              </w:tabs>
+              <w:rPr>
+                <w:rFonts w:ascii="Arial" w:hAnsi="Arial" w:cs="Arial"/>
+                <w:i/>
+                <w:snapToGrid w:val="0"/>
+                <w:color w:val="000000"/>
+                <w:sz w:val="18"/>
+                <w:szCs w:val="18"/>
+              </w:rPr>
+            </w:pPr>
+            <w:r>
+              <w:rPr>
+                <w:rFonts w:ascii="Arial" w:hAnsi="Arial" w:cs="Arial"/>
+                <w:i/>
+                <w:snapToGrid w:val="0"/>
+                <w:color w:val="000000"/>
+                <w:sz w:val="18"/>
+                <w:szCs w:val="18"/>
+              </w:rPr>
+              <w:t>(DD-MMM-YYYY)</w:t>
+            </w:r>
+            <w:r>
+              <w:rPr>
+                <w:rFonts w:ascii="Arial" w:hAnsi="Arial" w:cs="Arial"/>
+                <w:i/>
+                <w:snapToGrid w:val="0"/>
+                <w:color w:val="000000"/>
+                <w:sz w:val="18"/>
+                <w:szCs w:val="18"/>
+              </w:rPr>
+              <w:t xml:space="preserve"> </w:t>
+            </w:r>
+          </w:p>
         </w:tc>
       </w:tr>
       <w:tr>
+        <w:tblPrEx>
+          <w:jc w:val="left"/>
+          <w:tblCellMar>
+            <w:top w:w="0" w:type="dxa"/>
+            <w:bottom w:w="0" w:type="dxa"/>
+          </w:tblCellMar>
+        </w:tblPrEx>
         <w:trPr>
           <w:trHeight w:val="576"/>
         </w:trPr>
         <w:tc>
           <w:tcPr>
-            <w:tcW w:w="10314" w:type="dxa"/>
+            <w:tcW w:w="10116" w:type="dxa"/>
+            <w:gridSpan w:val="6"/>
             <w:vAlign w:val="center"/>
           </w:tcPr>
           <w:p>
@@ -1344,7 +1457,23 @@
                 <w:snapToGrid w:val="0"/>
                 <w:color w:val="000000"/>
               </w:rPr>
-              <w:t xml:space="preserve">Received verified by </w:t>
+              <w:t xml:space="preserve"> </w:t>
+            </w:r>
+            <w:r>
+              <w:rPr>
+                <w:rFonts w:ascii="Arial" w:hAnsi="Arial" w:cs="Arial"/>
+                <w:snapToGrid w:val="0"/>
+                <w:color w:val="000000"/>
+              </w:rPr>
+              <w:t xml:space="preserve">Processed </w:t>
+            </w:r>
+            <w:r>
+              <w:rPr>
+                <w:rFonts w:ascii="Arial" w:hAnsi="Arial" w:cs="Arial"/>
+                <w:snapToGrid w:val="0"/>
+                <w:color w:val="000000"/>
+              </w:rPr>
+              <w:t xml:space="preserve">by </w:t>
             </w:r>
             <w:r>
               <w:rPr>
@@ -1360,21 +1489,48 @@
                 <w:snapToGrid w:val="0"/>
                 <w:color w:val="000000"/>
               </w:rPr>
-              <w:t>:</w:t>
+              <w:t xml:space="preserve"> staff (</w:t>
             </w:r>
             <w:r>
               <w:rPr>
                 <w:rFonts w:ascii="Arial" w:hAnsi="Arial" w:cs="Arial"/>
+                <w:i/>
                 <w:snapToGrid w:val="0"/>
                 <w:color w:val="000000"/>
               </w:rPr>
-              <w:t xml:space="preserve"> </w:t>
+              <w:t>insert full name</w:t>
+            </w:r>
+            <w:r>
+              <w:rPr>
+                <w:rFonts w:ascii="Arial" w:hAnsi="Arial" w:cs="Arial"/>
+                <w:snapToGrid w:val="0"/>
+                <w:color w:val="000000"/>
+              </w:rPr>
+              <w:t>)</w:t>
+            </w:r>
+            <w:r>
+              <w:rPr>
+                <w:rFonts w:ascii="Arial" w:hAnsi="Arial" w:cs="Arial"/>
+                <w:snapToGrid w:val="0"/>
+                <w:color w:val="000000"/>
+              </w:rPr>
+              <w:t xml:space="preserve">: </w:t>
+            </w:r>
+            <w:r>
+              <w:rPr>
+                <w:rFonts w:ascii="Arial" w:hAnsi="Arial" w:cs="Arial"/>
+                <w:snapToGrid w:val="0"/>
+                <w:color w:val="000000"/>
+                <w:u w:val="single"/>
+              </w:rPr>
+              <w:t xml:space="preserve">                                                                                  </w:t>
             </w:r>
           </w:p>
         </w:tc>
         <w:tc>
           <w:tcPr>
-            <w:tcW w:w="3582" w:type="dxa"/>
+            <w:tcW w:w="3384" w:type="dxa"/>
+            <w:gridSpan w:val="2"/>
             <w:vAlign w:val="center"/>
           </w:tcPr>
           <w:p>
@@ -1396,13 +1552,36 @@
               </w:rPr>
               <w:t>Date:</w:t>
             </w:r>
-            <w:r>
+          </w:p>
+          <w:p>
+            <w:pPr>
+              <w:tabs>
+                <w:tab w:val="left" w:pos="360"/>
+              </w:tabs>
               <w:rPr>
                 <w:rFonts w:ascii="Arial" w:hAnsi="Arial" w:cs="Arial"/>
                 <w:snapToGrid w:val="0"/>
                 <w:color w:val="000000"/>
               </w:rPr>
-              <w:t xml:space="preserve"> </w:t>
+            </w:pPr>
+            <w:r>
+              <w:rPr>
+                <w:rFonts w:ascii="Arial" w:hAnsi="Arial" w:cs="Arial"/>
+                <w:i/>
+                <w:snapToGrid w:val="0"/>
+                <w:color w:val="000000"/>
+                <w:sz w:val="18"/>
+                <w:szCs w:val="18"/>
+              </w:rPr>
+              <w:t>(DD-MMM-YYYY</w:t>
+            </w:r>
+            <w:r>
+              <w:rPr>
+                <w:rFonts w:ascii="Arial" w:hAnsi="Arial" w:cs="Arial"/>
+                <w:snapToGrid w:val="0"/>
+                <w:color w:val="000000"/>
+              </w:rPr>
+              <w:t>)</w:t>
             </w:r>
           </w:p>
         </w:tc>
@@ -1424,29 +1603,9 @@
         </w:rPr>
       </w:pPr>
     </w:p>
-    <w:p>
-      <w:pPr>
-        <w:tabs>
-          <w:tab w:val="left" w:pos="360"/>
-        </w:tabs>
-        <w:jc w:val="center"/>
-        <w:rPr>
-          <w:rFonts w:ascii="Arial" w:hAnsi="Arial" w:cs="Arial"/>
-          <w:b/>
-          <w:bCs/>
-          <w:sz w:val="32"/>
-          <w:szCs w:val="32"/>
-          <w:u w:val="single"/>
-        </w:rPr>
-      </w:pPr>
-    </w:p>
     <w:sectPr>
-      <w:headerReference w:type="even" r:id="rId8"/>
-      <w:headerReference w:type="default" r:id="rId9"/>
-      <w:footerReference w:type="even" r:id="rId10"/>
-      <w:footerReference w:type="default" r:id="rId11"/>
-      <w:headerReference w:type="first" r:id="rId12"/>
-      <w:footerReference w:type="first" r:id="rId13"/>
+      <w:headerReference w:type="default" r:id="rId8"/>
+      <w:footerReference w:type="default" r:id="rId9"/>
       <w:pgSz w:w="15840" w:h="12240" w:orient="landscape" w:code="1"/>
       <w:pgMar w:top="720" w:right="720" w:bottom="720" w:left="1440" w:header="720" w:footer="720" w:gutter="0"/>
       <w:cols w:space="720"/>
@@ -1456,7 +1615,7 @@
 </file>
 
 <file path=word/endnotes.xml><?xml version="1.0" encoding="utf-8"?>
-<w:endnotes xmlns:wpc="http://schemas.microsoft.com/office/word/2010/wordprocessingCanvas" xmlns:cx="http://schemas.microsoft.com/office/drawing/2014/chartex" xmlns:cx1="http://schemas.microsoft.com/office/drawing/2015/9/8/chartex" xmlns:mc="http://schemas.openxmlformats.org/markup-compatibility/2006" xmlns:o="urn:schemas-microsoft-com:office:office" xmlns:r="http://schemas.openxmlformats.org/officeDocument/2006/relationships" xmlns:m="http://schemas.openxmlformats.org/officeDocument/2006/math" xmlns:v="urn:schemas-microsoft-com:vml" xmlns:wp14="http://schemas.microsoft.com/office/word/2010/wordprocessingDrawing" xmlns:wp="http://schemas.openxmlformats.org/drawingml/2006/wordprocessingDrawing" xmlns:w10="urn:schemas-microsoft-com:office:word" xmlns:w="http://schemas.openxmlformats.org/wordprocessingml/2006/main" xmlns:w14="http://schemas.microsoft.com/office/word/2010/wordml" xmlns:w15="http://schemas.microsoft.com/office/word/2012/wordml" xmlns:w16se="http://schemas.microsoft.com/office/word/2015/wordml/symex" xmlns:wpg="http://schemas.microsoft.com/office/word/2010/wordprocessingGroup" xmlns:wpi="http://schemas.microsoft.com/office/word/2010/wordprocessingInk" xmlns:wne="http://schemas.microsoft.com/office/word/2006/wordml" xmlns:wps="http://schemas.microsoft.com/office/word/2010/wordprocessingShape" mc:Ignorable="w14 w15 w16se wp14">
+<w:endnotes xmlns:wpc="http://schemas.microsoft.com/office/word/2010/wordprocessingCanvas" xmlns:cx="http://schemas.microsoft.com/office/drawing/2014/chartex" xmlns:cx1="http://schemas.microsoft.com/office/drawing/2015/9/8/chartex" xmlns:cx2="http://schemas.microsoft.com/office/drawing/2015/10/21/chartex" xmlns:cx3="http://schemas.microsoft.com/office/drawing/2016/5/9/chartex" xmlns:cx4="http://schemas.microsoft.com/office/drawing/2016/5/10/chartex" xmlns:cx5="http://schemas.microsoft.com/office/drawing/2016/5/11/chartex" xmlns:cx6="http://schemas.microsoft.com/office/drawing/2016/5/12/chartex" xmlns:cx7="http://schemas.microsoft.com/office/drawing/2016/5/13/chartex" xmlns:cx8="http://schemas.microsoft.com/office/drawing/2016/5/14/chartex" xmlns:mc="http://schemas.openxmlformats.org/markup-compatibility/2006" xmlns:aink="http://schemas.microsoft.com/office/drawing/2016/ink" xmlns:am3d="http://schemas.microsoft.com/office/drawing/2017/model3d" xmlns:o="urn:schemas-microsoft-com:office:office" xmlns:oel="http://schemas.microsoft.com/office/2019/extlst" xmlns:r="http://schemas.openxmlformats.org/officeDocument/2006/relationships" xmlns:m="http://schemas.openxmlformats.org/officeDocument/2006/math" xmlns:v="urn:schemas-microsoft-com:vml" xmlns:wp14="http://schemas.microsoft.com/office/word/2010/wordprocessingDrawing" xmlns:wp="http://schemas.openxmlformats.org/drawingml/2006/wordprocessingDrawing" xmlns:w10="urn:schemas-microsoft-com:office:word" xmlns:w="http://schemas.openxmlformats.org/wordprocessingml/2006/main" xmlns:w14="http://schemas.microsoft.com/office/word/2010/wordml" xmlns:w15="http://schemas.microsoft.com/office/word/2012/wordml" xmlns:w16cex="http://schemas.microsoft.com/office/word/2018/wordml/cex" xmlns:w16cid="http://schemas.microsoft.com/office/word/2016/wordml/cid" xmlns:w16="http://schemas.microsoft.com/office/word/2018/wordml" xmlns:w16du="http://schemas.microsoft.com/office/word/2023/wordml/word16du" xmlns:w16sdtdh="http://schemas.microsoft.com/office/word/2020/wordml/sdtdatahash" xmlns:w16sdtfl="http://schemas.microsoft.com/office/word/2024/wordml/sdtformatlock" xmlns:w16se="http://schemas.microsoft.com/office/word/2015/wordml/symex" xmlns:wpg="http://schemas.microsoft.com/office/word/2010/wordprocessingGroup" xmlns:wpi="http://schemas.microsoft.com/office/word/2010/wordprocessingInk" xmlns:wne="http://schemas.microsoft.com/office/word/2006/wordml" xmlns:wps="http://schemas.microsoft.com/office/word/2010/wordprocessingShape" mc:Ignorable="w14 w15 w16se w16cid w16 w16cex w16sdtdh w16sdtfl w16du wp14">
   <w:endnote w:type="separator" w:id="-1">
     <w:p>
       <w:r>
@@ -1475,35 +1634,26 @@
 </file>
 
 <file path=word/footer1.xml><?xml version="1.0" encoding="utf-8"?>
-<w:ftr xmlns:wpc="http://schemas.microsoft.com/office/word/2010/wordprocessingCanvas" xmlns:cx="http://schemas.microsoft.com/office/drawing/2014/chartex" xmlns:cx1="http://schemas.microsoft.com/office/drawing/2015/9/8/chartex" xmlns:mc="http://schemas.openxmlformats.org/markup-compatibility/2006" xmlns:o="urn:schemas-microsoft-com:office:office" xmlns:r="http://schemas.openxmlformats.org/officeDocument/2006/relationships" xmlns:m="http://schemas.openxmlformats.org/officeDocument/2006/math" xmlns:v="urn:schemas-microsoft-com:vml" xmlns:wp14="http://schemas.microsoft.com/office/word/2010/wordprocessingDrawing" xmlns:wp="http://schemas.openxmlformats.org/drawingml/2006/wordprocessingDrawing" xmlns:w10="urn:schemas-microsoft-com:office:word" xmlns:w="http://schemas.openxmlformats.org/wordprocessingml/2006/main" xmlns:w14="http://schemas.microsoft.com/office/word/2010/wordml" xmlns:w15="http://schemas.microsoft.com/office/word/2012/wordml" xmlns:w16se="http://schemas.microsoft.com/office/word/2015/wordml/symex" xmlns:wpg="http://schemas.microsoft.com/office/word/2010/wordprocessingGroup" xmlns:wpi="http://schemas.microsoft.com/office/word/2010/wordprocessingInk" xmlns:wne="http://schemas.microsoft.com/office/word/2006/wordml" xmlns:wps="http://schemas.microsoft.com/office/word/2010/wordprocessingShape" mc:Ignorable="w14 w15 w16se wp14">
+<w:ftr xmlns:wpc="http://schemas.microsoft.com/office/word/2010/wordprocessingCanvas" xmlns:cx="http://schemas.microsoft.com/office/drawing/2014/chartex" xmlns:cx1="http://schemas.microsoft.com/office/drawing/2015/9/8/chartex" xmlns:cx2="http://schemas.microsoft.com/office/drawing/2015/10/21/chartex" xmlns:cx3="http://schemas.microsoft.com/office/drawing/2016/5/9/chartex" xmlns:cx4="http://schemas.microsoft.com/office/drawing/2016/5/10/chartex" xmlns:cx5="http://schemas.microsoft.com/office/drawing/2016/5/11/chartex" xmlns:cx6="http://schemas.microsoft.com/office/drawing/2016/5/12/chartex" xmlns:cx7="http://schemas.microsoft.com/office/drawing/2016/5/13/chartex" xmlns:cx8="http://schemas.microsoft.com/office/drawing/2016/5/14/chartex" xmlns:mc="http://schemas.openxmlformats.org/markup-compatibility/2006" xmlns:aink="http://schemas.microsoft.com/office/drawing/2016/ink" xmlns:am3d="http://schemas.microsoft.com/office/drawing/2017/model3d" xmlns:o="urn:schemas-microsoft-com:office:office" xmlns:oel="http://schemas.microsoft.com/office/2019/extlst" xmlns:r="http://schemas.openxmlformats.org/officeDocument/2006/relationships" xmlns:m="http://schemas.openxmlformats.org/officeDocument/2006/math" xmlns:v="urn:schemas-microsoft-com:vml" xmlns:wp14="http://schemas.microsoft.com/office/word/2010/wordprocessingDrawing" xmlns:wp="http://schemas.openxmlformats.org/drawingml/2006/wordprocessingDrawing" xmlns:w10="urn:schemas-microsoft-com:office:word" xmlns:w="http://schemas.openxmlformats.org/wordprocessingml/2006/main" xmlns:w14="http://schemas.microsoft.com/office/word/2010/wordml" xmlns:w15="http://schemas.microsoft.com/office/word/2012/wordml" xmlns:w16cex="http://schemas.microsoft.com/office/word/2018/wordml/cex" xmlns:w16cid="http://schemas.microsoft.com/office/word/2016/wordml/cid" xmlns:w16="http://schemas.microsoft.com/office/word/2018/wordml" xmlns:w16du="http://schemas.microsoft.com/office/word/2023/wordml/word16du" xmlns:w16sdtdh="http://schemas.microsoft.com/office/word/2020/wordml/sdtdatahash" xmlns:w16sdtfl="http://schemas.microsoft.com/office/word/2024/wordml/sdtformatlock" xmlns:w16se="http://schemas.microsoft.com/office/word/2015/wordml/symex" xmlns:wpg="http://schemas.microsoft.com/office/word/2010/wordprocessingGroup" xmlns:wpi="http://schemas.microsoft.com/office/word/2010/wordprocessingInk" xmlns:wne="http://schemas.microsoft.com/office/word/2006/wordml" xmlns:wps="http://schemas.microsoft.com/office/word/2010/wordprocessingShape" mc:Ignorable="w14 w15 w16se w16cid w16 w16cex w16sdtdh w16sdtfl w16du wp14">
   <w:p>
     <w:pPr>
       <w:pStyle w:val="Footer"/>
-    </w:pPr>
-  </w:p>
-</w:ftr>
-</file>
-
-<file path=word/footer2.xml><?xml version="1.0" encoding="utf-8"?>
-<w:ftr xmlns:wpc="http://schemas.microsoft.com/office/word/2010/wordprocessingCanvas" xmlns:cx="http://schemas.microsoft.com/office/drawing/2014/chartex" xmlns:cx1="http://schemas.microsoft.com/office/drawing/2015/9/8/chartex" xmlns:mc="http://schemas.openxmlformats.org/markup-compatibility/2006" xmlns:o="urn:schemas-microsoft-com:office:office" xmlns:r="http://schemas.openxmlformats.org/officeDocument/2006/relationships" xmlns:m="http://schemas.openxmlformats.org/officeDocument/2006/math" xmlns:v="urn:schemas-microsoft-com:vml" xmlns:wp14="http://schemas.microsoft.com/office/word/2010/wordprocessingDrawing" xmlns:wp="http://schemas.openxmlformats.org/drawingml/2006/wordprocessingDrawing" xmlns:w10="urn:schemas-microsoft-com:office:word" xmlns:w="http://schemas.openxmlformats.org/wordprocessingml/2006/main" xmlns:w14="http://schemas.microsoft.com/office/word/2010/wordml" xmlns:w15="http://schemas.microsoft.com/office/word/2012/wordml" xmlns:w16se="http://schemas.microsoft.com/office/word/2015/wordml/symex" xmlns:wpg="http://schemas.microsoft.com/office/word/2010/wordprocessingGroup" xmlns:wpi="http://schemas.microsoft.com/office/word/2010/wordprocessingInk" xmlns:wne="http://schemas.microsoft.com/office/word/2006/wordml" xmlns:wps="http://schemas.microsoft.com/office/word/2010/wordprocessingShape" mc:Ignorable="w14 w15 w16se wp14">
-  <w:p>
-    <w:pPr>
-      <w:pStyle w:val="Footer"/>
-      <w:jc w:val="both"/>
+      <w:jc w:val="right"/>
     </w:pPr>
     <w:r>
-      <w:t xml:space="preserve">Location: </w:t>
+      <w:tab/>
     </w:r>
     <w:r>
-      <w:t>\\Dcnsbiona01a\chs\ISO\Data Management 300\301 source data management</w:t>
+      <w:tab/>
     </w:r>
-  </w:p>
-  <w:p>
-    <w:pPr>
-      <w:pStyle w:val="Footer"/>
-      <w:jc w:val="center"/>
-    </w:pPr>
     <w:r>
+      <w:tab/>
+    </w:r>
+    <w:r>
+      <w:tab/>
+    </w:r>
+    <w:r>
+      <w:tab/>
       <w:t xml:space="preserve">Page </w:t>
     </w:r>
     <w:r>
@@ -1537,7 +1687,7 @@
         <w:bCs/>
         <w:noProof/>
       </w:rPr>
-      <w:t>1</w:t>
+      <w:t>2</w:t>
     </w:r>
     <w:r>
       <w:rPr>
@@ -1582,7 +1732,7 @@
         <w:bCs/>
         <w:noProof/>
       </w:rPr>
-      <w:t>1</w:t>
+      <w:t>2</w:t>
     </w:r>
     <w:r>
       <w:rPr>
@@ -1594,21 +1744,17 @@
       <w:fldChar w:fldCharType="end"/>
     </w:r>
   </w:p>
-</w:ftr>
-</file>
-
-<file path=word/footer3.xml><?xml version="1.0" encoding="utf-8"?>
-<w:ftr xmlns:wpc="http://schemas.microsoft.com/office/word/2010/wordprocessingCanvas" xmlns:cx="http://schemas.microsoft.com/office/drawing/2014/chartex" xmlns:cx1="http://schemas.microsoft.com/office/drawing/2015/9/8/chartex" xmlns:mc="http://schemas.openxmlformats.org/markup-compatibility/2006" xmlns:o="urn:schemas-microsoft-com:office:office" xmlns:r="http://schemas.openxmlformats.org/officeDocument/2006/relationships" xmlns:m="http://schemas.openxmlformats.org/officeDocument/2006/math" xmlns:v="urn:schemas-microsoft-com:vml" xmlns:wp14="http://schemas.microsoft.com/office/word/2010/wordprocessingDrawing" xmlns:wp="http://schemas.openxmlformats.org/drawingml/2006/wordprocessingDrawing" xmlns:w10="urn:schemas-microsoft-com:office:word" xmlns:w="http://schemas.openxmlformats.org/wordprocessingml/2006/main" xmlns:w14="http://schemas.microsoft.com/office/word/2010/wordml" xmlns:w15="http://schemas.microsoft.com/office/word/2012/wordml" xmlns:w16se="http://schemas.microsoft.com/office/word/2015/wordml/symex" xmlns:wpg="http://schemas.microsoft.com/office/word/2010/wordprocessingGroup" xmlns:wpi="http://schemas.microsoft.com/office/word/2010/wordprocessingInk" xmlns:wne="http://schemas.microsoft.com/office/word/2006/wordml" xmlns:wps="http://schemas.microsoft.com/office/word/2010/wordprocessingShape" mc:Ignorable="w14 w15 w16se wp14">
   <w:p>
     <w:pPr>
       <w:pStyle w:val="Footer"/>
+      <w:jc w:val="both"/>
     </w:pPr>
   </w:p>
 </w:ftr>
 </file>
 
 <file path=word/footnotes.xml><?xml version="1.0" encoding="utf-8"?>
-<w:footnotes xmlns:wpc="http://schemas.microsoft.com/office/word/2010/wordprocessingCanvas" xmlns:cx="http://schemas.microsoft.com/office/drawing/2014/chartex" xmlns:cx1="http://schemas.microsoft.com/office/drawing/2015/9/8/chartex" xmlns:mc="http://schemas.openxmlformats.org/markup-compatibility/2006" xmlns:o="urn:schemas-microsoft-com:office:office" xmlns:r="http://schemas.openxmlformats.org/officeDocument/2006/relationships" xmlns:m="http://schemas.openxmlformats.org/officeDocument/2006/math" xmlns:v="urn:schemas-microsoft-com:vml" xmlns:wp14="http://schemas.microsoft.com/office/word/2010/wordprocessingDrawing" xmlns:wp="http://schemas.openxmlformats.org/drawingml/2006/wordprocessingDrawing" xmlns:w10="urn:schemas-microsoft-com:office:word" xmlns:w="http://schemas.openxmlformats.org/wordprocessingml/2006/main" xmlns:w14="http://schemas.microsoft.com/office/word/2010/wordml" xmlns:w15="http://schemas.microsoft.com/office/word/2012/wordml" xmlns:w16se="http://schemas.microsoft.com/office/word/2015/wordml/symex" xmlns:wpg="http://schemas.microsoft.com/office/word/2010/wordprocessingGroup" xmlns:wpi="http://schemas.microsoft.com/office/word/2010/wordprocessingInk" xmlns:wne="http://schemas.microsoft.com/office/word/2006/wordml" xmlns:wps="http://schemas.microsoft.com/office/word/2010/wordprocessingShape" mc:Ignorable="w14 w15 w16se wp14">
+<w:footnotes xmlns:wpc="http://schemas.microsoft.com/office/word/2010/wordprocessingCanvas" xmlns:cx="http://schemas.microsoft.com/office/drawing/2014/chartex" xmlns:cx1="http://schemas.microsoft.com/office/drawing/2015/9/8/chartex" xmlns:cx2="http://schemas.microsoft.com/office/drawing/2015/10/21/chartex" xmlns:cx3="http://schemas.microsoft.com/office/drawing/2016/5/9/chartex" xmlns:cx4="http://schemas.microsoft.com/office/drawing/2016/5/10/chartex" xmlns:cx5="http://schemas.microsoft.com/office/drawing/2016/5/11/chartex" xmlns:cx6="http://schemas.microsoft.com/office/drawing/2016/5/12/chartex" xmlns:cx7="http://schemas.microsoft.com/office/drawing/2016/5/13/chartex" xmlns:cx8="http://schemas.microsoft.com/office/drawing/2016/5/14/chartex" xmlns:mc="http://schemas.openxmlformats.org/markup-compatibility/2006" xmlns:aink="http://schemas.microsoft.com/office/drawing/2016/ink" xmlns:am3d="http://schemas.microsoft.com/office/drawing/2017/model3d" xmlns:o="urn:schemas-microsoft-com:office:office" xmlns:oel="http://schemas.microsoft.com/office/2019/extlst" xmlns:r="http://schemas.openxmlformats.org/officeDocument/2006/relationships" xmlns:m="http://schemas.openxmlformats.org/officeDocument/2006/math" xmlns:v="urn:schemas-microsoft-com:vml" xmlns:wp14="http://schemas.microsoft.com/office/word/2010/wordprocessingDrawing" xmlns:wp="http://schemas.openxmlformats.org/drawingml/2006/wordprocessingDrawing" xmlns:w10="urn:schemas-microsoft-com:office:word" xmlns:w="http://schemas.openxmlformats.org/wordprocessingml/2006/main" xmlns:w14="http://schemas.microsoft.com/office/word/2010/wordml" xmlns:w15="http://schemas.microsoft.com/office/word/2012/wordml" xmlns:w16cex="http://schemas.microsoft.com/office/word/2018/wordml/cex" xmlns:w16cid="http://schemas.microsoft.com/office/word/2016/wordml/cid" xmlns:w16="http://schemas.microsoft.com/office/word/2018/wordml" xmlns:w16du="http://schemas.microsoft.com/office/word/2023/wordml/word16du" xmlns:w16sdtdh="http://schemas.microsoft.com/office/word/2020/wordml/sdtdatahash" xmlns:w16sdtfl="http://schemas.microsoft.com/office/word/2024/wordml/sdtformatlock" xmlns:w16se="http://schemas.microsoft.com/office/word/2015/wordml/symex" xmlns:wpg="http://schemas.microsoft.com/office/word/2010/wordprocessingGroup" xmlns:wpi="http://schemas.microsoft.com/office/word/2010/wordprocessingInk" xmlns:wne="http://schemas.microsoft.com/office/word/2006/wordml" xmlns:wps="http://schemas.microsoft.com/office/word/2010/wordprocessingShape" mc:Ignorable="w14 w15 w16se w16cid w16 w16cex w16sdtdh w16sdtfl w16du wp14">
   <w:footnote w:type="separator" w:id="-1">
     <w:p>
       <w:r>
@@ -1627,121 +1773,164 @@
 </file>
 
 <file path=word/header1.xml><?xml version="1.0" encoding="utf-8"?>
-<w:hdr xmlns:wpc="http://schemas.microsoft.com/office/word/2010/wordprocessingCanvas" xmlns:cx="http://schemas.microsoft.com/office/drawing/2014/chartex" xmlns:cx1="http://schemas.microsoft.com/office/drawing/2015/9/8/chartex" xmlns:mc="http://schemas.openxmlformats.org/markup-compatibility/2006" xmlns:o="urn:schemas-microsoft-com:office:office" xmlns:r="http://schemas.openxmlformats.org/officeDocument/2006/relationships" xmlns:m="http://schemas.openxmlformats.org/officeDocument/2006/math" xmlns:v="urn:schemas-microsoft-com:vml" xmlns:wp14="http://schemas.microsoft.com/office/word/2010/wordprocessingDrawing" xmlns:wp="http://schemas.openxmlformats.org/drawingml/2006/wordprocessingDrawing" xmlns:w10="urn:schemas-microsoft-com:office:word" xmlns:w="http://schemas.openxmlformats.org/wordprocessingml/2006/main" xmlns:w14="http://schemas.microsoft.com/office/word/2010/wordml" xmlns:w15="http://schemas.microsoft.com/office/word/2012/wordml" xmlns:w16se="http://schemas.microsoft.com/office/word/2015/wordml/symex" xmlns:wpg="http://schemas.microsoft.com/office/word/2010/wordprocessingGroup" xmlns:wpi="http://schemas.microsoft.com/office/word/2010/wordprocessingInk" xmlns:wne="http://schemas.microsoft.com/office/word/2006/wordml" xmlns:wps="http://schemas.microsoft.com/office/word/2010/wordprocessingShape" mc:Ignorable="w14 w15 w16se wp14">
+<w:hdr xmlns:wpc="http://schemas.microsoft.com/office/word/2010/wordprocessingCanvas" xmlns:cx="http://schemas.microsoft.com/office/drawing/2014/chartex" xmlns:cx1="http://schemas.microsoft.com/office/drawing/2015/9/8/chartex" xmlns:cx2="http://schemas.microsoft.com/office/drawing/2015/10/21/chartex" xmlns:cx3="http://schemas.microsoft.com/office/drawing/2016/5/9/chartex" xmlns:cx4="http://schemas.microsoft.com/office/drawing/2016/5/10/chartex" xmlns:cx5="http://schemas.microsoft.com/office/drawing/2016/5/11/chartex" xmlns:cx6="http://schemas.microsoft.com/office/drawing/2016/5/12/chartex" xmlns:cx7="http://schemas.microsoft.com/office/drawing/2016/5/13/chartex" xmlns:cx8="http://schemas.microsoft.com/office/drawing/2016/5/14/chartex" xmlns:mc="http://schemas.openxmlformats.org/markup-compatibility/2006" xmlns:aink="http://schemas.microsoft.com/office/drawing/2016/ink" xmlns:am3d="http://schemas.microsoft.com/office/drawing/2017/model3d" xmlns:o="urn:schemas-microsoft-com:office:office" xmlns:oel="http://schemas.microsoft.com/office/2019/extlst" xmlns:r="http://schemas.openxmlformats.org/officeDocument/2006/relationships" xmlns:m="http://schemas.openxmlformats.org/officeDocument/2006/math" xmlns:v="urn:schemas-microsoft-com:vml" xmlns:wp14="http://schemas.microsoft.com/office/word/2010/wordprocessingDrawing" xmlns:wp="http://schemas.openxmlformats.org/drawingml/2006/wordprocessingDrawing" xmlns:w10="urn:schemas-microsoft-com:office:word" xmlns:w="http://schemas.openxmlformats.org/wordprocessingml/2006/main" xmlns:w14="http://schemas.microsoft.com/office/word/2010/wordml" xmlns:w15="http://schemas.microsoft.com/office/word/2012/wordml" xmlns:w16cex="http://schemas.microsoft.com/office/word/2018/wordml/cex" xmlns:w16cid="http://schemas.microsoft.com/office/word/2016/wordml/cid" xmlns:w16="http://schemas.microsoft.com/office/word/2018/wordml" xmlns:w16du="http://schemas.microsoft.com/office/word/2023/wordml/word16du" xmlns:w16sdtdh="http://schemas.microsoft.com/office/word/2020/wordml/sdtdatahash" xmlns:w16sdtfl="http://schemas.microsoft.com/office/word/2024/wordml/sdtformatlock" xmlns:w16se="http://schemas.microsoft.com/office/word/2015/wordml/symex" xmlns:wpg="http://schemas.microsoft.com/office/word/2010/wordprocessingGroup" xmlns:wpi="http://schemas.microsoft.com/office/word/2010/wordprocessingInk" xmlns:wne="http://schemas.microsoft.com/office/word/2006/wordml" xmlns:wps="http://schemas.microsoft.com/office/word/2010/wordprocessingShape" mc:Ignorable="w14 w15 w16se w16cid w16 w16cex w16sdtdh w16sdtfl w16du wp14">
   <w:p>
     <w:pPr>
       <w:pStyle w:val="Header"/>
-    </w:pPr>
-  </w:p>
-</w:hdr>
-</file>
-
-<file path=word/header2.xml><?xml version="1.0" encoding="utf-8"?>
-<w:hdr xmlns:wpc="http://schemas.microsoft.com/office/word/2010/wordprocessingCanvas" xmlns:cx="http://schemas.microsoft.com/office/drawing/2014/chartex" xmlns:cx1="http://schemas.microsoft.com/office/drawing/2015/9/8/chartex" xmlns:mc="http://schemas.openxmlformats.org/markup-compatibility/2006" xmlns:o="urn:schemas-microsoft-com:office:office" xmlns:r="http://schemas.openxmlformats.org/officeDocument/2006/relationships" xmlns:m="http://schemas.openxmlformats.org/officeDocument/2006/math" xmlns:v="urn:schemas-microsoft-com:vml" xmlns:wp14="http://schemas.microsoft.com/office/word/2010/wordprocessingDrawing" xmlns:wp="http://schemas.openxmlformats.org/drawingml/2006/wordprocessingDrawing" xmlns:w10="urn:schemas-microsoft-com:office:word" xmlns:w="http://schemas.openxmlformats.org/wordprocessingml/2006/main" xmlns:w14="http://schemas.microsoft.com/office/word/2010/wordml" xmlns:w15="http://schemas.microsoft.com/office/word/2012/wordml" xmlns:w16se="http://schemas.microsoft.com/office/word/2015/wordml/symex" xmlns:wpg="http://schemas.microsoft.com/office/word/2010/wordprocessingGroup" xmlns:wpi="http://schemas.microsoft.com/office/word/2010/wordprocessingInk" xmlns:wne="http://schemas.microsoft.com/office/word/2006/wordml" xmlns:wps="http://schemas.microsoft.com/office/word/2010/wordprocessingShape" mc:Ignorable="w14 w15 w16se wp14">
-  <w:p>
-    <w:pPr>
-      <w:pStyle w:val="Header"/>
+      <w:ind w:right="90"/>
       <w:rPr>
         <w:b/>
       </w:rPr>
     </w:pPr>
-    <w:r>
-      <w:t xml:space="preserve">Version: </w:t>
-    </w:r>
-    <w:r>
-      <w:t>1</w:t>
-    </w:r>
-    <w:r>
+  </w:p>
+  <w:tbl>
+    <w:tblPr>
+      <w:tblW w:w="0" w:type="auto"/>
+      <w:tblInd w:w="198" w:type="dxa"/>
+      <w:tblLook w:val="04A0" w:firstRow="1" w:lastRow="0" w:firstColumn="1" w:lastColumn="0" w:noHBand="0" w:noVBand="1"/>
+    </w:tblPr>
+    <w:tblGrid>
+      <w:gridCol w:w="4434"/>
+      <w:gridCol w:w="4632"/>
+      <w:gridCol w:w="4434"/>
+    </w:tblGrid>
+    <w:tr>
+      <w:tc>
+        <w:tcPr>
+          <w:tcW w:w="4434" w:type="dxa"/>
+          <w:shd w:val="clear" w:color="auto" w:fill="auto"/>
+        </w:tcPr>
+        <w:p>
+          <w:pPr>
+            <w:pStyle w:val="Header"/>
+            <w:ind w:right="90"/>
+          </w:pPr>
+          <w:r>
+            <w:t xml:space="preserve">Version: </w:t>
+          </w:r>
+          <w:r>
+            <w:t>3</w:t>
+          </w:r>
+          <w:r>
+            <w:t xml:space="preserve"> </w:t>
+          </w:r>
+        </w:p>
+        <w:p>
+          <w:pPr>
+            <w:pStyle w:val="Header"/>
+            <w:ind w:right="90"/>
+            <w:rPr>
+              <w:b/>
+            </w:rPr>
+          </w:pPr>
+          <w:r>
+            <w:t>Effective: 202</w:t>
+          </w:r>
+          <w:r>
+            <w:t>2</w:t>
+          </w:r>
+          <w:r>
+            <w:t>-</w:t>
+          </w:r>
+          <w:r>
+            <w:t>06-0</w:t>
+          </w:r>
+          <w:r>
+            <w:t>9</w:t>
+          </w:r>
+        </w:p>
+      </w:tc>
+      <w:tc>
+        <w:tcPr>
+          <w:tcW w:w="4632" w:type="dxa"/>
+          <w:shd w:val="clear" w:color="auto" w:fill="auto"/>
+        </w:tcPr>
+        <w:p>
+          <w:pPr>
+            <w:pStyle w:val="Header"/>
+            <w:ind w:right="90"/>
+            <w:jc w:val="center"/>
+            <w:rPr>
+              <w:b/>
+            </w:rPr>
+          </w:pPr>
+          <w:r>
+            <w:rPr>
+              <w:sz w:val="28"/>
+              <w:szCs w:val="28"/>
+            </w:rPr>
+            <w:t>CHS Atlantic Data Submission Transmittal Record</w:t>
+          </w:r>
+        </w:p>
+      </w:tc>
+      <w:tc>
+        <w:tcPr>
+          <w:tcW w:w="4434" w:type="dxa"/>
+          <w:shd w:val="clear" w:color="auto" w:fill="auto"/>
+        </w:tcPr>
+        <w:p>
+          <w:pPr>
+            <w:pStyle w:val="Header"/>
+            <w:ind w:right="90"/>
+            <w:jc w:val="right"/>
+          </w:pPr>
+          <w:r>
+            <w:rPr>
+              <w:b/>
+            </w:rPr>
+            <w:t>1001-07-AF01</w:t>
+          </w:r>
+          <w:r>
+            <w:t xml:space="preserve"> </w:t>
+          </w:r>
+        </w:p>
+        <w:p>
+          <w:pPr>
+            <w:pStyle w:val="Header"/>
+            <w:ind w:right="90"/>
+            <w:jc w:val="right"/>
+          </w:pPr>
+          <w:r>
+            <w:t xml:space="preserve">Owner: Manager, </w:t>
+          </w:r>
+        </w:p>
+        <w:p>
+          <w:pPr>
+            <w:pStyle w:val="Header"/>
+            <w:ind w:right="90"/>
+            <w:jc w:val="right"/>
+            <w:rPr>
+              <w:b/>
+            </w:rPr>
+          </w:pPr>
+          <w:r>
+            <w:t>Nautical Products and Hydrographic Data</w:t>
+          </w:r>
+        </w:p>
+      </w:tc>
+    </w:tr>
+  </w:tbl>
+  <w:p>
+    <w:pPr>
+      <w:pStyle w:val="Header"/>
+      <w:ind w:right="90"/>
       <w:rPr>
         <w:b/>
       </w:rPr>
-      <w:tab/>
-      <w:t xml:space="preserve">                               </w:t>
-    </w:r>
-    <w:r>
-      <w:tab/>
-      <w:t xml:space="preserve">  </w:t>
-    </w:r>
-    <w:r>
-      <w:tab/>
-    </w:r>
-    <w:r>
-      <w:tab/>
-    </w:r>
-    <w:r>
-      <w:t xml:space="preserve">                                            </w:t>
-    </w:r>
-    <w:r>
-      <w:rPr>
-        <w:b/>
-      </w:rPr>
-      <w:t>1001-07-A-F01</w:t>
-    </w:r>
-  </w:p>
-  <w:p>
-    <w:pPr>
-      <w:pStyle w:val="Header"/>
     </w:pPr>
-    <w:r>
-      <w:t>Effective: 2019-08-06</w:t>
-    </w:r>
-    <w:r>
-      <w:rPr>
-        <w:sz w:val="28"/>
-      </w:rPr>
-      <w:tab/>
-    </w:r>
     <w:r>
       <w:rPr>
         <w:sz w:val="28"/>
         <w:szCs w:val="28"/>
       </w:rPr>
       <w:tab/>
-      <w:t>CHS Atlantic Data Submission Protocol</w:t>
-    </w:r>
-    <w:r>
-      <w:rPr>
-        <w:sz w:val="28"/>
-      </w:rPr>
-      <w:t xml:space="preserve"> </w:t>
-    </w:r>
-    <w:r>
-      <w:rPr>
-        <w:sz w:val="28"/>
-      </w:rPr>
-      <w:tab/>
-    </w:r>
-    <w:r>
-      <w:rPr>
-        <w:sz w:val="28"/>
-      </w:rPr>
-      <w:tab/>
-    </w:r>
-    <w:r>
-      <w:rPr>
-        <w:sz w:val="28"/>
-      </w:rPr>
-      <w:t xml:space="preserve">               </w:t>
-    </w:r>
-    <w:r>
-      <w:t>Owner: Manager, Updating</w:t>
     </w:r>
   </w:p>
 </w:hdr>
 </file>
 
-<file path=word/header3.xml><?xml version="1.0" encoding="utf-8"?>
-<w:hdr xmlns:wpc="http://schemas.microsoft.com/office/word/2010/wordprocessingCanvas" xmlns:cx="http://schemas.microsoft.com/office/drawing/2014/chartex" xmlns:cx1="http://schemas.microsoft.com/office/drawing/2015/9/8/chartex" xmlns:mc="http://schemas.openxmlformats.org/markup-compatibility/2006" xmlns:o="urn:schemas-microsoft-com:office:office" xmlns:r="http://schemas.openxmlformats.org/officeDocument/2006/relationships" xmlns:m="http://schemas.openxmlformats.org/officeDocument/2006/math" xmlns:v="urn:schemas-microsoft-com:vml" xmlns:wp14="http://schemas.microsoft.com/office/word/2010/wordprocessingDrawing" xmlns:wp="http://schemas.openxmlformats.org/drawingml/2006/wordprocessingDrawing" xmlns:w10="urn:schemas-microsoft-com:office:word" xmlns:w="http://schemas.openxmlformats.org/wordprocessingml/2006/main" xmlns:w14="http://schemas.microsoft.com/office/word/2010/wordml" xmlns:w15="http://schemas.microsoft.com/office/word/2012/wordml" xmlns:w16se="http://schemas.microsoft.com/office/word/2015/wordml/symex" xmlns:wpg="http://schemas.microsoft.com/office/word/2010/wordprocessingGroup" xmlns:wpi="http://schemas.microsoft.com/office/word/2010/wordprocessingInk" xmlns:wne="http://schemas.microsoft.com/office/word/2006/wordml" xmlns:wps="http://schemas.microsoft.com/office/word/2010/wordprocessingShape" mc:Ignorable="w14 w15 w16se wp14">
-  <w:p>
-    <w:pPr>
-      <w:pStyle w:val="Header"/>
-    </w:pPr>
-  </w:p>
-</w:hdr>
-</file>
-
 <file path=word/numbering.xml><?xml version="1.0" encoding="utf-8"?>
-<w:numbering xmlns:wpc="http://schemas.microsoft.com/office/word/2010/wordprocessingCanvas" xmlns:cx="http://schemas.microsoft.com/office/drawing/2014/chartex" xmlns:cx1="http://schemas.microsoft.com/office/drawing/2015/9/8/chartex" xmlns:mc="http://schemas.openxmlformats.org/markup-compatibility/2006" xmlns:o="urn:schemas-microsoft-com:office:office" xmlns:r="http://schemas.openxmlformats.org/officeDocument/2006/relationships" xmlns:m="http://schemas.openxmlformats.org/officeDocument/2006/math" xmlns:v="urn:schemas-microsoft-com:vml" xmlns:wp14="http://schemas.microsoft.com/office/word/2010/wordprocessingDrawing" xmlns:wp="http://schemas.openxmlformats.org/drawingml/2006/wordprocessingDrawing" xmlns:w10="urn:schemas-microsoft-com:office:word" xmlns:w="http://schemas.openxmlformats.org/wordprocessingml/2006/main" xmlns:w14="http://schemas.microsoft.com/office/word/2010/wordml" xmlns:w15="http://schemas.microsoft.com/office/word/2012/wordml" xmlns:w16se="http://schemas.microsoft.com/office/word/2015/wordml/symex" xmlns:wpg="http://schemas.microsoft.com/office/word/2010/wordprocessingGroup" xmlns:wpi="http://schemas.microsoft.com/office/word/2010/wordprocessingInk" xmlns:wne="http://schemas.microsoft.com/office/word/2006/wordml" xmlns:wps="http://schemas.microsoft.com/office/word/2010/wordprocessingShape" mc:Ignorable="w14 w15 w16se wp14">
+<w:numbering xmlns:wpc="http://schemas.microsoft.com/office/word/2010/wordprocessingCanvas" xmlns:cx="http://schemas.microsoft.com/office/drawing/2014/chartex" xmlns:cx1="http://schemas.microsoft.com/office/drawing/2015/9/8/chartex" xmlns:cx2="http://schemas.microsoft.com/office/drawing/2015/10/21/chartex" xmlns:cx3="http://schemas.microsoft.com/office/drawing/2016/5/9/chartex" xmlns:cx4="http://schemas.microsoft.com/office/drawing/2016/5/10/chartex" xmlns:cx5="http://schemas.microsoft.com/office/drawing/2016/5/11/chartex" xmlns:cx6="http://schemas.microsoft.com/office/drawing/2016/5/12/chartex" xmlns:cx7="http://schemas.microsoft.com/office/drawing/2016/5/13/chartex" xmlns:cx8="http://schemas.microsoft.com/office/drawing/2016/5/14/chartex" xmlns:mc="http://schemas.openxmlformats.org/markup-compatibility/2006" xmlns:aink="http://schemas.microsoft.com/office/drawing/2016/ink" xmlns:am3d="http://schemas.microsoft.com/office/drawing/2017/model3d" xmlns:o="urn:schemas-microsoft-com:office:office" xmlns:oel="http://schemas.microsoft.com/office/2019/extlst" xmlns:r="http://schemas.openxmlformats.org/officeDocument/2006/relationships" xmlns:m="http://schemas.openxmlformats.org/officeDocument/2006/math" xmlns:v="urn:schemas-microsoft-com:vml" xmlns:wp14="http://schemas.microsoft.com/office/word/2010/wordprocessingDrawing" xmlns:wp="http://schemas.openxmlformats.org/drawingml/2006/wordprocessingDrawing" xmlns:w10="urn:schemas-microsoft-com:office:word" xmlns:w="http://schemas.openxmlformats.org/wordprocessingml/2006/main" xmlns:w14="http://schemas.microsoft.com/office/word/2010/wordml" xmlns:w15="http://schemas.microsoft.com/office/word/2012/wordml" xmlns:w16cex="http://schemas.microsoft.com/office/word/2018/wordml/cex" xmlns:w16cid="http://schemas.microsoft.com/office/word/2016/wordml/cid" xmlns:w16="http://schemas.microsoft.com/office/word/2018/wordml" xmlns:w16du="http://schemas.microsoft.com/office/word/2023/wordml/word16du" xmlns:w16sdtdh="http://schemas.microsoft.com/office/word/2020/wordml/sdtdatahash" xmlns:w16sdtfl="http://schemas.microsoft.com/office/word/2024/wordml/sdtformatlock" xmlns:w16se="http://schemas.microsoft.com/office/word/2015/wordml/symex" xmlns:wpg="http://schemas.microsoft.com/office/word/2010/wordprocessingGroup" xmlns:wpi="http://schemas.microsoft.com/office/word/2010/wordprocessingInk" xmlns:wne="http://schemas.microsoft.com/office/word/2006/wordml" xmlns:wps="http://schemas.microsoft.com/office/word/2010/wordprocessingShape" mc:Ignorable="w14 w15 w16se w16cid w16 w16cex w16sdtdh w16sdtfl w16du wp14">
   <w:abstractNum w:abstractNumId="0" w15:restartNumberingAfterBreak="0">
     <w:nsid w:val="060E7028"/>
     <w:multiLevelType w:val="hybridMultilevel"/>
@@ -4882,112 +5071,112 @@
       </w:pPr>
     </w:lvl>
   </w:abstractNum>
-  <w:num w:numId="1">
+  <w:num w:numId="1" w16cid:durableId="35588816">
     <w:abstractNumId w:val="31"/>
   </w:num>
-  <w:num w:numId="2">
+  <w:num w:numId="2" w16cid:durableId="2063750977">
     <w:abstractNumId w:val="19"/>
   </w:num>
-  <w:num w:numId="3">
+  <w:num w:numId="3" w16cid:durableId="574823501">
     <w:abstractNumId w:val="4"/>
   </w:num>
-  <w:num w:numId="4">
+  <w:num w:numId="4" w16cid:durableId="2108381544">
     <w:abstractNumId w:val="8"/>
   </w:num>
-  <w:num w:numId="5">
+  <w:num w:numId="5" w16cid:durableId="623777212">
     <w:abstractNumId w:val="12"/>
   </w:num>
-  <w:num w:numId="6">
+  <w:num w:numId="6" w16cid:durableId="1967468775">
     <w:abstractNumId w:val="33"/>
   </w:num>
-  <w:num w:numId="7">
+  <w:num w:numId="7" w16cid:durableId="1003044624">
     <w:abstractNumId w:val="6"/>
   </w:num>
-  <w:num w:numId="8">
+  <w:num w:numId="8" w16cid:durableId="1999721668">
     <w:abstractNumId w:val="25"/>
   </w:num>
-  <w:num w:numId="9">
+  <w:num w:numId="9" w16cid:durableId="863371276">
     <w:abstractNumId w:val="10"/>
   </w:num>
-  <w:num w:numId="10">
+  <w:num w:numId="10" w16cid:durableId="1870217121">
     <w:abstractNumId w:val="35"/>
   </w:num>
-  <w:num w:numId="11">
+  <w:num w:numId="11" w16cid:durableId="1327049172">
     <w:abstractNumId w:val="34"/>
   </w:num>
-  <w:num w:numId="12">
+  <w:num w:numId="12" w16cid:durableId="1463768883">
     <w:abstractNumId w:val="21"/>
   </w:num>
-  <w:num w:numId="13">
+  <w:num w:numId="13" w16cid:durableId="279073740">
     <w:abstractNumId w:val="24"/>
   </w:num>
-  <w:num w:numId="14">
+  <w:num w:numId="14" w16cid:durableId="78403874">
     <w:abstractNumId w:val="1"/>
   </w:num>
-  <w:num w:numId="15">
+  <w:num w:numId="15" w16cid:durableId="1148132686">
     <w:abstractNumId w:val="18"/>
   </w:num>
-  <w:num w:numId="16">
+  <w:num w:numId="16" w16cid:durableId="1763456464">
     <w:abstractNumId w:val="22"/>
   </w:num>
-  <w:num w:numId="17">
+  <w:num w:numId="17" w16cid:durableId="717701852">
     <w:abstractNumId w:val="5"/>
   </w:num>
-  <w:num w:numId="18">
+  <w:num w:numId="18" w16cid:durableId="748506550">
     <w:abstractNumId w:val="15"/>
   </w:num>
-  <w:num w:numId="19">
+  <w:num w:numId="19" w16cid:durableId="110587859">
     <w:abstractNumId w:val="14"/>
   </w:num>
-  <w:num w:numId="20">
+  <w:num w:numId="20" w16cid:durableId="1067609522">
     <w:abstractNumId w:val="0"/>
   </w:num>
-  <w:num w:numId="21">
+  <w:num w:numId="21" w16cid:durableId="119228310">
     <w:abstractNumId w:val="17"/>
   </w:num>
-  <w:num w:numId="22">
+  <w:num w:numId="22" w16cid:durableId="391395619">
     <w:abstractNumId w:val="16"/>
   </w:num>
-  <w:num w:numId="23">
+  <w:num w:numId="23" w16cid:durableId="986664951">
     <w:abstractNumId w:val="30"/>
   </w:num>
-  <w:num w:numId="24">
+  <w:num w:numId="24" w16cid:durableId="2050108015">
     <w:abstractNumId w:val="27"/>
   </w:num>
-  <w:num w:numId="25">
+  <w:num w:numId="25" w16cid:durableId="469597416">
     <w:abstractNumId w:val="28"/>
   </w:num>
-  <w:num w:numId="26">
+  <w:num w:numId="26" w16cid:durableId="686096665">
     <w:abstractNumId w:val="7"/>
   </w:num>
-  <w:num w:numId="27">
+  <w:num w:numId="27" w16cid:durableId="1471048627">
     <w:abstractNumId w:val="32"/>
   </w:num>
-  <w:num w:numId="28">
+  <w:num w:numId="28" w16cid:durableId="236719536">
     <w:abstractNumId w:val="20"/>
   </w:num>
-  <w:num w:numId="29">
+  <w:num w:numId="29" w16cid:durableId="1247109806">
     <w:abstractNumId w:val="9"/>
   </w:num>
-  <w:num w:numId="30">
+  <w:num w:numId="30" w16cid:durableId="5249131">
     <w:abstractNumId w:val="29"/>
   </w:num>
-  <w:num w:numId="31">
+  <w:num w:numId="31" w16cid:durableId="1810708548">
     <w:abstractNumId w:val="13"/>
   </w:num>
-  <w:num w:numId="32">
+  <w:num w:numId="32" w16cid:durableId="938635783">
     <w:abstractNumId w:val="2"/>
   </w:num>
-  <w:num w:numId="33">
+  <w:num w:numId="33" w16cid:durableId="1170606150">
     <w:abstractNumId w:val="3"/>
   </w:num>
-  <w:num w:numId="34">
+  <w:num w:numId="34" w16cid:durableId="551843369">
     <w:abstractNumId w:val="23"/>
   </w:num>
-  <w:num w:numId="35">
+  <w:num w:numId="35" w16cid:durableId="1578440635">
     <w:abstractNumId w:val="11"/>
   </w:num>
-  <w:num w:numId="36">
+  <w:num w:numId="36" w16cid:durableId="199364143">
     <w:abstractNumId w:val="26"/>
   </w:num>
   <w:numIdMacAtCleanup w:val="3"/>
@@ -4995,7 +5184,7 @@
 </file>
 
 <file path=word/styles.xml><?xml version="1.0" encoding="utf-8"?>
-<w:styles xmlns:mc="http://schemas.openxmlformats.org/markup-compatibility/2006" xmlns:r="http://schemas.openxmlformats.org/officeDocument/2006/relationships" xmlns:w="http://schemas.openxmlformats.org/wordprocessingml/2006/main" xmlns:w14="http://schemas.microsoft.com/office/word/2010/wordml" xmlns:w15="http://schemas.microsoft.com/office/word/2012/wordml" xmlns:w16se="http://schemas.microsoft.com/office/word/2015/wordml/symex" mc:Ignorable="w14 w15 w16se">
+<w:styles xmlns:mc="http://schemas.openxmlformats.org/markup-compatibility/2006" xmlns:r="http://schemas.openxmlformats.org/officeDocument/2006/relationships" xmlns:w="http://schemas.openxmlformats.org/wordprocessingml/2006/main" xmlns:w14="http://schemas.microsoft.com/office/word/2010/wordml" xmlns:w15="http://schemas.microsoft.com/office/word/2012/wordml" xmlns:w16cex="http://schemas.microsoft.com/office/word/2018/wordml/cex" xmlns:w16cid="http://schemas.microsoft.com/office/word/2016/wordml/cid" xmlns:w16="http://schemas.microsoft.com/office/word/2018/wordml" xmlns:w16du="http://schemas.microsoft.com/office/word/2023/wordml/word16du" xmlns:w16sdtdh="http://schemas.microsoft.com/office/word/2020/wordml/sdtdatahash" xmlns:w16sdtfl="http://schemas.microsoft.com/office/word/2024/wordml/sdtformatlock" xmlns:w16se="http://schemas.microsoft.com/office/word/2015/wordml/symex" mc:Ignorable="w14 w15 w16se w16cid w16 w16cex w16sdtdh w16sdtfl w16du">
   <w:docDefaults>
     <w:rPrDefault>
       <w:rPr>
@@ -5005,7 +5194,7 @@
     </w:rPrDefault>
     <w:pPrDefault/>
   </w:docDefaults>
-  <w:latentStyles w:defLockedState="0" w:defUIPriority="99" w:defSemiHidden="0" w:defUnhideWhenUsed="0" w:defQFormat="0" w:count="371">
+  <w:latentStyles w:defLockedState="0" w:defUIPriority="99" w:defSemiHidden="0" w:defUnhideWhenUsed="0" w:defQFormat="0" w:count="376">
     <w:lsdException w:name="Normal" w:uiPriority="0" w:qFormat="1"/>
     <w:lsdException w:name="heading 1" w:uiPriority="9" w:qFormat="1"/>
     <w:lsdException w:name="heading 2" w:uiPriority="9" w:qFormat="1"/>
@@ -5377,6 +5566,11 @@
     <w:lsdException w:name="List Table 5 Dark Accent 6" w:uiPriority="50"/>
     <w:lsdException w:name="List Table 6 Colorful Accent 6" w:uiPriority="51"/>
     <w:lsdException w:name="List Table 7 Colorful Accent 6" w:uiPriority="52"/>
+    <w:lsdException w:name="Mention" w:semiHidden="1" w:unhideWhenUsed="1"/>
+    <w:lsdException w:name="Smart Hyperlink" w:semiHidden="1" w:unhideWhenUsed="1"/>
+    <w:lsdException w:name="Hashtag" w:semiHidden="1" w:unhideWhenUsed="1"/>
+    <w:lsdException w:name="Unresolved Mention" w:semiHidden="1" w:unhideWhenUsed="1"/>
+    <w:lsdException w:name="Smart Link" w:semiHidden="1" w:unhideWhenUsed="1"/>
   </w:latentStyles>
   <w:style w:type="paragraph" w:default="1" w:styleId="Normal">
     <w:name w:val="Normal"/>
@@ -5469,15 +5663,11 @@
   </w:style>
   <w:style w:type="character" w:default="1" w:styleId="DefaultParagraphFont">
     <w:name w:val="Default Paragraph Font"/>
-    <w:uiPriority w:val="1"/>
     <w:semiHidden/>
-    <w:unhideWhenUsed/>
   </w:style>
   <w:style w:type="table" w:default="1" w:styleId="TableNormal">
     <w:name w:val="Normal Table"/>
-    <w:uiPriority w:val="99"/>
     <w:semiHidden/>
-    <w:unhideWhenUsed/>
     <w:tblPr>
       <w:tblInd w:w="0" w:type="dxa"/>
       <w:tblCellMar>
@@ -5490,9 +5680,7 @@
   </w:style>
   <w:style w:type="numbering" w:default="1" w:styleId="NoList">
     <w:name w:val="No List"/>
-    <w:uiPriority w:val="99"/>
     <w:semiHidden/>
-    <w:unhideWhenUsed/>
   </w:style>
   <w:style w:type="paragraph" w:styleId="Title">
     <w:name w:val="Title"/>
@@ -5594,6 +5782,16 @@
       <w:lang w:eastAsia="en-US"/>
     </w:rPr>
   </w:style>
+  <w:style w:type="paragraph" w:styleId="Revision">
+    <w:name w:val="Revision"/>
+    <w:hidden/>
+    <w:uiPriority w:val="99"/>
+    <w:semiHidden/>
+    <w:rsid w:val="00506C68"/>
+    <w:rPr>
+      <w:lang w:val="en-CA"/>
+    </w:rPr>
+  </w:style>
 </w:styles>
 </file>
 
@@ -5608,39 +5806,39 @@
         <a:sysClr val="window" lastClr="FFFFFF"/>
       </a:lt1>
       <a:dk2>
-        <a:srgbClr val="44546A"/>
+        <a:srgbClr val="0E2841"/>
       </a:dk2>
       <a:lt2>
-        <a:srgbClr val="E7E6E6"/>
+        <a:srgbClr val="E8E8E8"/>
       </a:lt2>
       <a:accent1>
-        <a:srgbClr val="5B9BD5"/>
+        <a:srgbClr val="156082"/>
       </a:accent1>
       <a:accent2>
-        <a:srgbClr val="ED7D31"/>
+        <a:srgbClr val="E97132"/>
       </a:accent2>
       <a:accent3>
-        <a:srgbClr val="A5A5A5"/>
+        <a:srgbClr val="196B24"/>
       </a:accent3>
       <a:accent4>
-        <a:srgbClr val="FFC000"/>
+        <a:srgbClr val="0F9ED5"/>
       </a:accent4>
       <a:accent5>
-        <a:srgbClr val="4472C4"/>
+        <a:srgbClr val="A02B93"/>
       </a:accent5>
       <a:accent6>
-        <a:srgbClr val="70AD47"/>
+        <a:srgbClr val="4EA72E"/>
       </a:accent6>
       <a:hlink>
-        <a:srgbClr val="0563C1"/>
+        <a:srgbClr val="467886"/>
       </a:hlink>
       <a:folHlink>
-        <a:srgbClr val="954F72"/>
+        <a:srgbClr val="96607D"/>
       </a:folHlink>
     </a:clrScheme>
     <a:fontScheme name="Office">
       <a:majorFont>
-        <a:latin typeface="Calibri Light" panose="020F0302020204030204"/>
+        <a:latin typeface="Aptos Display" panose="02110004020202020204"/>
         <a:ea typeface=""/>
         <a:cs typeface=""/>
         <a:font script="Jpan" typeface="游ゴシック Light"/>
@@ -5673,9 +5871,26 @@
         <a:font script="Viet" typeface="Times New Roman"/>
         <a:font script="Uigh" typeface="Microsoft Uighur"/>
         <a:font script="Geor" typeface="Sylfaen"/>
+        <a:font script="Armn" typeface="Arial"/>
+        <a:font script="Bugi" typeface="Leelawadee UI"/>
+        <a:font script="Bopo" typeface="Microsoft JhengHei"/>
+        <a:font script="Java" typeface="Javanese Text"/>
+        <a:font script="Lisu" typeface="Segoe UI"/>
+        <a:font script="Mymr" typeface="Myanmar Text"/>
+        <a:font script="Nkoo" typeface="Ebrima"/>
+        <a:font script="Olck" typeface="Nirmala UI"/>
+        <a:font script="Osma" typeface="Ebrima"/>
+        <a:font script="Phag" typeface="Phagspa"/>
+        <a:font script="Syrn" typeface="Estrangelo Edessa"/>
+        <a:font script="Syrj" typeface="Estrangelo Edessa"/>
+        <a:font script="Syre" typeface="Estrangelo Edessa"/>
+        <a:font script="Sora" typeface="Nirmala UI"/>
+        <a:font script="Tale" typeface="Microsoft Tai Le"/>
+        <a:font script="Talu" typeface="Microsoft New Tai Lue"/>
+        <a:font script="Tfng" typeface="Ebrima"/>
       </a:majorFont>
       <a:minorFont>
-        <a:latin typeface="Calibri" panose="020F0502020204030204"/>
+        <a:latin typeface="Aptos" panose="02110004020202020204"/>
         <a:ea typeface=""/>
         <a:cs typeface=""/>
         <a:font script="Jpan" typeface="游明朝"/>
@@ -5708,6 +5923,23 @@
         <a:font script="Viet" typeface="Arial"/>
         <a:font script="Uigh" typeface="Microsoft Uighur"/>
         <a:font script="Geor" typeface="Sylfaen"/>
+        <a:font script="Armn" typeface="Arial"/>
+        <a:font script="Bugi" typeface="Leelawadee UI"/>
+        <a:font script="Bopo" typeface="Microsoft JhengHei"/>
+        <a:font script="Java" typeface="Javanese Text"/>
+        <a:font script="Lisu" typeface="Segoe UI"/>
+        <a:font script="Mymr" typeface="Myanmar Text"/>
+        <a:font script="Nkoo" typeface="Ebrima"/>
+        <a:font script="Olck" typeface="Nirmala UI"/>
+        <a:font script="Osma" typeface="Ebrima"/>
+        <a:font script="Phag" typeface="Phagspa"/>
+        <a:font script="Syrn" typeface="Estrangelo Edessa"/>
+        <a:font script="Syrj" typeface="Estrangelo Edessa"/>
+        <a:font script="Syre" typeface="Estrangelo Edessa"/>
+        <a:font script="Sora" typeface="Nirmala UI"/>
+        <a:font script="Tale" typeface="Microsoft Tai Le"/>
+        <a:font script="Talu" typeface="Microsoft New Tai Lue"/>
+        <a:font script="Tfng" typeface="Ebrima"/>
       </a:minorFont>
     </a:fontScheme>
     <a:fmtScheme name="Office">
@@ -5769,13 +6001,6 @@
         </a:gradFill>
       </a:fillStyleLst>
       <a:lnStyleLst>
-        <a:ln w="6350" cap="flat" cmpd="sng" algn="ctr">
-          <a:solidFill>
-            <a:schemeClr val="phClr"/>
-          </a:solidFill>
-          <a:prstDash val="solid"/>
-          <a:miter lim="800000"/>
-        </a:ln>
         <a:ln w="12700" cap="flat" cmpd="sng" algn="ctr">
           <a:solidFill>
             <a:schemeClr val="phClr"/>
@@ -5784,6 +6009,13 @@
           <a:miter lim="800000"/>
         </a:ln>
         <a:ln w="19050" cap="flat" cmpd="sng" algn="ctr">
+          <a:solidFill>
+            <a:schemeClr val="phClr"/>
+          </a:solidFill>
+          <a:prstDash val="solid"/>
+          <a:miter lim="800000"/>
+        </a:ln>
+        <a:ln w="25400" cap="flat" cmpd="sng" algn="ctr">
           <a:solidFill>
             <a:schemeClr val="phClr"/>
           </a:solidFill>
@@ -5848,11 +6080,31 @@
       </a:bgFillStyleLst>
     </a:fmtScheme>
   </a:themeElements>
-  <a:objectDefaults/>
+  <a:objectDefaults>
+    <a:lnDef>
+      <a:spPr/>
+      <a:bodyPr/>
+      <a:lstStyle/>
+      <a:style>
+        <a:lnRef idx="2">
+          <a:schemeClr val="accent1"/>
+        </a:lnRef>
+        <a:fillRef idx="0">
+          <a:schemeClr val="accent1"/>
+        </a:fillRef>
+        <a:effectRef idx="1">
+          <a:schemeClr val="accent1"/>
+        </a:effectRef>
+        <a:fontRef idx="minor">
+          <a:schemeClr val="tx1"/>
+        </a:fontRef>
+      </a:style>
+    </a:lnDef>
+  </a:objectDefaults>
   <a:extraClrSchemeLst/>
   <a:extLst>
     <a:ext uri="{05A4C25C-085E-4340-85A3-A5531E510DB2}">
-      <thm15:themeFamily xmlns:thm15="http://schemas.microsoft.com/office/thememl/2012/main" name="Office Theme" id="{62F939B6-93AF-4DB8-9C6B-D6C7DFDC589F}" vid="{4A3C46E8-61CC-4603-A589-7422A47A8E4A}"/>
+      <thm15:themeFamily xmlns:thm15="http://schemas.microsoft.com/office/thememl/2012/main" name="Office Theme" id="{2E142A2C-CD16-42D6-873A-C26D2A0506FA}" vid="{1BDDFF52-6CD6-40A5-AB3C-68EB2F1E4D0A}"/>
     </a:ext>
   </a:extLst>
 </a:theme>
@@ -5863,7 +6115,7 @@
 </file>
 
 <file path=customXml/itemProps1.xml><?xml version="1.0" encoding="utf-8"?>
-<ds:datastoreItem xmlns:ds="http://schemas.openxmlformats.org/officeDocument/2006/customXml" ds:itemID="{D997191E-3CD4-4AA5-9AEC-0EF1188ED298}">
+<ds:datastoreItem xmlns:ds="http://schemas.openxmlformats.org/officeDocument/2006/customXml" ds:itemID="{82F4D7D7-F3DB-4A9B-8A72-58DA9136A49F}">
   <ds:schemaRefs>
     <ds:schemaRef ds:uri="http://schemas.openxmlformats.org/officeDocument/2006/bibliography"/>
   </ds:schemaRefs>

</xml_diff>